<commit_message>
Improve documentation table layout
</commit_message>
<xml_diff>
--- a/Documentation_Application_Gestion_Contrats.docx
+++ b/Documentation_Application_Gestion_Contrats.docx
@@ -23,27 +23,36 @@
     <w:tbl>
       <w:tblPr>
         <w:tblStyle w:val="TableGrid"/>
-        <w:tblW w:type="auto" w:w="0"/>
-        <w:jc w:val="left"/>
+        <w:tblW w:type="dxa" w:w="9000"/>
+        <w:jc w:val="center"/>
         <w:tblLayout w:type="fixed"/>
         <w:tblLook w:firstColumn="1" w:firstRow="1" w:lastColumn="0" w:lastRow="0" w:noHBand="0" w:noVBand="1" w:val="04A0"/>
       </w:tblPr>
       <w:tblGrid>
-        <w:gridCol w:w="4968"/>
-        <w:gridCol w:w="4968"/>
+        <w:gridCol w:w="2800"/>
+        <w:gridCol w:w="6200"/>
       </w:tblGrid>
       <w:tr>
+        <w:trPr>
+          <w:cantSplit/>
+          <w:tblHeader w:val="true"/>
+        </w:trPr>
         <w:tc>
           <w:tcPr>
-            <w:tcW w:type="dxa" w:w="2592"/>
+            <w:tcW w:type="dxa" w:w="4"/>
             <w:vAlign w:val="center"/>
             <w:shd w:fill="E2E8F0"/>
           </w:tcPr>
           <w:p>
             <w:pPr>
+              <w:spacing w:after="40"/>
               <w:jc w:val="left"/>
             </w:pPr>
-            <w:r/>
+            <w:r>
+              <w:rPr>
+                <w:sz w:val="19"/>
+              </w:rPr>
+            </w:r>
             <w:r>
               <w:rPr>
                 <w:rFonts w:ascii="Arial" w:hAnsi="Arial"/>
@@ -57,15 +66,20 @@
         </w:tc>
         <w:tc>
           <w:tcPr>
-            <w:tcW w:type="dxa" w:w="8496"/>
+            <w:tcW w:type="dxa" w:w="10"/>
             <w:vAlign w:val="center"/>
             <w:shd w:fill="E2E8F0"/>
           </w:tcPr>
           <w:p>
             <w:pPr>
+              <w:spacing w:after="40"/>
               <w:jc w:val="left"/>
             </w:pPr>
-            <w:r/>
+            <w:r>
+              <w:rPr>
+                <w:sz w:val="19"/>
+              </w:rPr>
+            </w:r>
             <w:r>
               <w:rPr>
                 <w:rFonts w:ascii="Arial" w:hAnsi="Arial"/>
@@ -79,16 +93,24 @@
         </w:tc>
       </w:tr>
       <w:tr>
+        <w:trPr>
+          <w:cantSplit/>
+        </w:trPr>
         <w:tc>
           <w:tcPr>
-            <w:tcW w:type="dxa" w:w="2592"/>
+            <w:tcW w:type="dxa" w:w="4"/>
             <w:vAlign w:val="center"/>
           </w:tcPr>
           <w:p>
             <w:pPr>
+              <w:spacing w:after="40"/>
               <w:jc w:val="left"/>
             </w:pPr>
-            <w:r/>
+            <w:r>
+              <w:rPr>
+                <w:sz w:val="19"/>
+              </w:rPr>
+            </w:r>
             <w:r>
               <w:rPr>
                 <w:rFonts w:ascii="Arial" w:hAnsi="Arial"/>
@@ -102,14 +124,19 @@
         </w:tc>
         <w:tc>
           <w:tcPr>
-            <w:tcW w:type="dxa" w:w="8496"/>
+            <w:tcW w:type="dxa" w:w="10"/>
             <w:vAlign w:val="center"/>
           </w:tcPr>
           <w:p>
             <w:pPr>
+              <w:spacing w:after="40"/>
               <w:jc w:val="left"/>
             </w:pPr>
-            <w:r/>
+            <w:r>
+              <w:rPr>
+                <w:sz w:val="19"/>
+              </w:rPr>
+            </w:r>
             <w:r>
               <w:rPr>
                 <w:rFonts w:ascii="Arial" w:hAnsi="Arial"/>
@@ -123,16 +150,24 @@
         </w:tc>
       </w:tr>
       <w:tr>
+        <w:trPr>
+          <w:cantSplit/>
+        </w:trPr>
         <w:tc>
           <w:tcPr>
-            <w:tcW w:type="dxa" w:w="2592"/>
+            <w:tcW w:type="dxa" w:w="4"/>
             <w:vAlign w:val="center"/>
           </w:tcPr>
           <w:p>
             <w:pPr>
+              <w:spacing w:after="40"/>
               <w:jc w:val="left"/>
             </w:pPr>
-            <w:r/>
+            <w:r>
+              <w:rPr>
+                <w:sz w:val="19"/>
+              </w:rPr>
+            </w:r>
             <w:r>
               <w:rPr>
                 <w:rFonts w:ascii="Arial" w:hAnsi="Arial"/>
@@ -146,14 +181,19 @@
         </w:tc>
         <w:tc>
           <w:tcPr>
-            <w:tcW w:type="dxa" w:w="8496"/>
+            <w:tcW w:type="dxa" w:w="10"/>
             <w:vAlign w:val="center"/>
           </w:tcPr>
           <w:p>
             <w:pPr>
+              <w:spacing w:after="40"/>
               <w:jc w:val="left"/>
             </w:pPr>
-            <w:r/>
+            <w:r>
+              <w:rPr>
+                <w:sz w:val="19"/>
+              </w:rPr>
+            </w:r>
             <w:r>
               <w:rPr>
                 <w:rFonts w:ascii="Arial" w:hAnsi="Arial"/>
@@ -167,16 +207,24 @@
         </w:tc>
       </w:tr>
       <w:tr>
+        <w:trPr>
+          <w:cantSplit/>
+        </w:trPr>
         <w:tc>
           <w:tcPr>
-            <w:tcW w:type="dxa" w:w="2592"/>
+            <w:tcW w:type="dxa" w:w="4"/>
             <w:vAlign w:val="center"/>
           </w:tcPr>
           <w:p>
             <w:pPr>
+              <w:spacing w:after="40"/>
               <w:jc w:val="left"/>
             </w:pPr>
-            <w:r/>
+            <w:r>
+              <w:rPr>
+                <w:sz w:val="19"/>
+              </w:rPr>
+            </w:r>
             <w:r>
               <w:rPr>
                 <w:rFonts w:ascii="Arial" w:hAnsi="Arial"/>
@@ -190,27 +238,41 @@
         </w:tc>
         <w:tc>
           <w:tcPr>
-            <w:tcW w:type="dxa" w:w="8496"/>
+            <w:tcW w:type="dxa" w:w="10"/>
             <w:vAlign w:val="center"/>
           </w:tcPr>
           <w:p>
-            <w:r>
+            <w:pPr>
+              <w:spacing w:after="40"/>
+            </w:pPr>
+            <w:r>
+              <w:rPr>
+                <w:sz w:val="19"/>
+              </w:rPr>
               <w:t>1.1</w:t>
             </w:r>
           </w:p>
         </w:tc>
       </w:tr>
       <w:tr>
+        <w:trPr>
+          <w:cantSplit/>
+        </w:trPr>
         <w:tc>
           <w:tcPr>
-            <w:tcW w:type="dxa" w:w="2592"/>
+            <w:tcW w:type="dxa" w:w="4"/>
             <w:vAlign w:val="center"/>
           </w:tcPr>
           <w:p>
             <w:pPr>
+              <w:spacing w:after="40"/>
               <w:jc w:val="left"/>
             </w:pPr>
-            <w:r/>
+            <w:r>
+              <w:rPr>
+                <w:sz w:val="19"/>
+              </w:rPr>
+            </w:r>
             <w:r>
               <w:rPr>
                 <w:rFonts w:ascii="Arial" w:hAnsi="Arial"/>
@@ -224,11 +286,17 @@
         </w:tc>
         <w:tc>
           <w:tcPr>
-            <w:tcW w:type="dxa" w:w="8496"/>
+            <w:tcW w:type="dxa" w:w="10"/>
             <w:vAlign w:val="center"/>
           </w:tcPr>
           <w:p>
-            <w:r>
+            <w:pPr>
+              <w:spacing w:after="40"/>
+            </w:pPr>
+            <w:r>
+              <w:rPr>
+                <w:sz w:val="19"/>
+              </w:rPr>
               <w:t>12/05/2026</w:t>
             </w:r>
           </w:p>
@@ -343,28 +411,37 @@
     <w:tbl>
       <w:tblPr>
         <w:tblStyle w:val="TableGrid"/>
-        <w:tblW w:type="auto" w:w="0"/>
-        <w:jc w:val="left"/>
+        <w:tblW w:type="dxa" w:w="9000"/>
+        <w:jc w:val="center"/>
         <w:tblLayout w:type="fixed"/>
         <w:tblLook w:firstColumn="1" w:firstRow="1" w:lastColumn="0" w:lastRow="0" w:noHBand="0" w:noVBand="1" w:val="04A0"/>
       </w:tblPr>
       <w:tblGrid>
-        <w:gridCol w:w="3312"/>
-        <w:gridCol w:w="3312"/>
-        <w:gridCol w:w="3312"/>
+        <w:gridCol w:w="1250"/>
+        <w:gridCol w:w="2400"/>
+        <w:gridCol w:w="5350"/>
       </w:tblGrid>
       <w:tr>
+        <w:trPr>
+          <w:cantSplit/>
+          <w:tblHeader w:val="true"/>
+        </w:trPr>
         <w:tc>
           <w:tcPr>
-            <w:tcW w:type="dxa" w:w="1008"/>
+            <w:tcW w:type="dxa" w:w="2"/>
             <w:vAlign w:val="center"/>
             <w:shd w:fill="E2E8F0"/>
           </w:tcPr>
           <w:p>
             <w:pPr>
+              <w:spacing w:after="40"/>
               <w:jc w:val="left"/>
             </w:pPr>
-            <w:r/>
+            <w:r>
+              <w:rPr>
+                <w:sz w:val="19"/>
+              </w:rPr>
+            </w:r>
             <w:r>
               <w:rPr>
                 <w:rFonts w:ascii="Arial" w:hAnsi="Arial"/>
@@ -378,15 +455,20 @@
         </w:tc>
         <w:tc>
           <w:tcPr>
-            <w:tcW w:type="dxa" w:w="2376"/>
+            <w:tcW w:type="dxa" w:w="4"/>
             <w:vAlign w:val="center"/>
             <w:shd w:fill="E2E8F0"/>
           </w:tcPr>
           <w:p>
             <w:pPr>
+              <w:spacing w:after="40"/>
               <w:jc w:val="left"/>
             </w:pPr>
-            <w:r/>
+            <w:r>
+              <w:rPr>
+                <w:sz w:val="19"/>
+              </w:rPr>
+            </w:r>
             <w:r>
               <w:rPr>
                 <w:rFonts w:ascii="Arial" w:hAnsi="Arial"/>
@@ -400,15 +482,20 @@
         </w:tc>
         <w:tc>
           <w:tcPr>
-            <w:tcW w:type="dxa" w:w="7704"/>
+            <w:tcW w:type="dxa" w:w="8"/>
             <w:vAlign w:val="center"/>
             <w:shd w:fill="E2E8F0"/>
           </w:tcPr>
           <w:p>
             <w:pPr>
+              <w:spacing w:after="40"/>
               <w:jc w:val="left"/>
             </w:pPr>
-            <w:r/>
+            <w:r>
+              <w:rPr>
+                <w:sz w:val="19"/>
+              </w:rPr>
+            </w:r>
             <w:r>
               <w:rPr>
                 <w:rFonts w:ascii="Arial" w:hAnsi="Arial"/>
@@ -422,16 +509,24 @@
         </w:tc>
       </w:tr>
       <w:tr>
+        <w:trPr>
+          <w:cantSplit/>
+        </w:trPr>
         <w:tc>
           <w:tcPr>
-            <w:tcW w:type="dxa" w:w="1008"/>
+            <w:tcW w:type="dxa" w:w="2"/>
             <w:vAlign w:val="center"/>
           </w:tcPr>
           <w:p>
             <w:pPr>
+              <w:spacing w:after="40"/>
               <w:jc w:val="left"/>
             </w:pPr>
-            <w:r/>
+            <w:r>
+              <w:rPr>
+                <w:sz w:val="19"/>
+              </w:rPr>
+            </w:r>
             <w:r>
               <w:rPr>
                 <w:rFonts w:ascii="Arial" w:hAnsi="Arial"/>
@@ -445,14 +540,19 @@
         </w:tc>
         <w:tc>
           <w:tcPr>
-            <w:tcW w:type="dxa" w:w="2376"/>
+            <w:tcW w:type="dxa" w:w="4"/>
             <w:vAlign w:val="center"/>
           </w:tcPr>
           <w:p>
             <w:pPr>
+              <w:spacing w:after="40"/>
               <w:jc w:val="left"/>
             </w:pPr>
-            <w:r/>
+            <w:r>
+              <w:rPr>
+                <w:sz w:val="19"/>
+              </w:rPr>
+            </w:r>
             <w:r>
               <w:rPr>
                 <w:rFonts w:ascii="Arial" w:hAnsi="Arial"/>
@@ -466,14 +566,19 @@
         </w:tc>
         <w:tc>
           <w:tcPr>
-            <w:tcW w:type="dxa" w:w="7704"/>
+            <w:tcW w:type="dxa" w:w="8"/>
             <w:vAlign w:val="center"/>
           </w:tcPr>
           <w:p>
             <w:pPr>
+              <w:spacing w:after="40"/>
               <w:jc w:val="left"/>
             </w:pPr>
-            <w:r/>
+            <w:r>
+              <w:rPr>
+                <w:sz w:val="19"/>
+              </w:rPr>
+            </w:r>
             <w:r>
               <w:rPr>
                 <w:rFonts w:ascii="Arial" w:hAnsi="Arial"/>
@@ -487,16 +592,24 @@
         </w:tc>
       </w:tr>
       <w:tr>
+        <w:trPr>
+          <w:cantSplit/>
+        </w:trPr>
         <w:tc>
           <w:tcPr>
-            <w:tcW w:type="dxa" w:w="1008"/>
+            <w:tcW w:type="dxa" w:w="2"/>
             <w:vAlign w:val="center"/>
           </w:tcPr>
           <w:p>
             <w:pPr>
+              <w:spacing w:after="40"/>
               <w:jc w:val="left"/>
             </w:pPr>
-            <w:r/>
+            <w:r>
+              <w:rPr>
+                <w:sz w:val="19"/>
+              </w:rPr>
+            </w:r>
             <w:r>
               <w:rPr>
                 <w:rFonts w:ascii="Arial" w:hAnsi="Arial"/>
@@ -510,14 +623,19 @@
         </w:tc>
         <w:tc>
           <w:tcPr>
-            <w:tcW w:type="dxa" w:w="2376"/>
+            <w:tcW w:type="dxa" w:w="4"/>
             <w:vAlign w:val="center"/>
           </w:tcPr>
           <w:p>
             <w:pPr>
+              <w:spacing w:after="40"/>
               <w:jc w:val="left"/>
             </w:pPr>
-            <w:r/>
+            <w:r>
+              <w:rPr>
+                <w:sz w:val="19"/>
+              </w:rPr>
+            </w:r>
             <w:r>
               <w:rPr>
                 <w:rFonts w:ascii="Arial" w:hAnsi="Arial"/>
@@ -531,14 +649,19 @@
         </w:tc>
         <w:tc>
           <w:tcPr>
-            <w:tcW w:type="dxa" w:w="7704"/>
+            <w:tcW w:type="dxa" w:w="8"/>
             <w:vAlign w:val="center"/>
           </w:tcPr>
           <w:p>
             <w:pPr>
+              <w:spacing w:after="40"/>
               <w:jc w:val="left"/>
             </w:pPr>
-            <w:r/>
+            <w:r>
+              <w:rPr>
+                <w:sz w:val="19"/>
+              </w:rPr>
+            </w:r>
             <w:r>
               <w:rPr>
                 <w:rFonts w:ascii="Arial" w:hAnsi="Arial"/>
@@ -552,16 +675,24 @@
         </w:tc>
       </w:tr>
       <w:tr>
+        <w:trPr>
+          <w:cantSplit/>
+        </w:trPr>
         <w:tc>
           <w:tcPr>
-            <w:tcW w:type="dxa" w:w="1008"/>
+            <w:tcW w:type="dxa" w:w="2"/>
             <w:vAlign w:val="center"/>
           </w:tcPr>
           <w:p>
             <w:pPr>
+              <w:spacing w:after="40"/>
               <w:jc w:val="left"/>
             </w:pPr>
-            <w:r/>
+            <w:r>
+              <w:rPr>
+                <w:sz w:val="19"/>
+              </w:rPr>
+            </w:r>
             <w:r>
               <w:rPr>
                 <w:rFonts w:ascii="Arial" w:hAnsi="Arial"/>
@@ -575,14 +706,19 @@
         </w:tc>
         <w:tc>
           <w:tcPr>
-            <w:tcW w:type="dxa" w:w="2376"/>
+            <w:tcW w:type="dxa" w:w="4"/>
             <w:vAlign w:val="center"/>
           </w:tcPr>
           <w:p>
             <w:pPr>
+              <w:spacing w:after="40"/>
               <w:jc w:val="left"/>
             </w:pPr>
-            <w:r/>
+            <w:r>
+              <w:rPr>
+                <w:sz w:val="19"/>
+              </w:rPr>
+            </w:r>
             <w:r>
               <w:rPr>
                 <w:rFonts w:ascii="Arial" w:hAnsi="Arial"/>
@@ -596,14 +732,19 @@
         </w:tc>
         <w:tc>
           <w:tcPr>
-            <w:tcW w:type="dxa" w:w="7704"/>
+            <w:tcW w:type="dxa" w:w="8"/>
             <w:vAlign w:val="center"/>
           </w:tcPr>
           <w:p>
             <w:pPr>
+              <w:spacing w:after="40"/>
               <w:jc w:val="left"/>
             </w:pPr>
-            <w:r/>
+            <w:r>
+              <w:rPr>
+                <w:sz w:val="19"/>
+              </w:rPr>
+            </w:r>
             <w:r>
               <w:rPr>
                 <w:rFonts w:ascii="Arial" w:hAnsi="Arial"/>
@@ -617,16 +758,24 @@
         </w:tc>
       </w:tr>
       <w:tr>
+        <w:trPr>
+          <w:cantSplit/>
+        </w:trPr>
         <w:tc>
           <w:tcPr>
-            <w:tcW w:type="dxa" w:w="1008"/>
+            <w:tcW w:type="dxa" w:w="2"/>
             <w:vAlign w:val="center"/>
           </w:tcPr>
           <w:p>
             <w:pPr>
+              <w:spacing w:after="40"/>
               <w:jc w:val="left"/>
             </w:pPr>
-            <w:r/>
+            <w:r>
+              <w:rPr>
+                <w:sz w:val="19"/>
+              </w:rPr>
+            </w:r>
             <w:r>
               <w:rPr>
                 <w:rFonts w:ascii="Arial" w:hAnsi="Arial"/>
@@ -640,14 +789,19 @@
         </w:tc>
         <w:tc>
           <w:tcPr>
-            <w:tcW w:type="dxa" w:w="2376"/>
+            <w:tcW w:type="dxa" w:w="4"/>
             <w:vAlign w:val="center"/>
           </w:tcPr>
           <w:p>
             <w:pPr>
+              <w:spacing w:after="40"/>
               <w:jc w:val="left"/>
             </w:pPr>
-            <w:r/>
+            <w:r>
+              <w:rPr>
+                <w:sz w:val="19"/>
+              </w:rPr>
+            </w:r>
             <w:r>
               <w:rPr>
                 <w:rFonts w:ascii="Arial" w:hAnsi="Arial"/>
@@ -661,14 +815,19 @@
         </w:tc>
         <w:tc>
           <w:tcPr>
-            <w:tcW w:type="dxa" w:w="7704"/>
+            <w:tcW w:type="dxa" w:w="8"/>
             <w:vAlign w:val="center"/>
           </w:tcPr>
           <w:p>
             <w:pPr>
+              <w:spacing w:after="40"/>
               <w:jc w:val="left"/>
             </w:pPr>
-            <w:r/>
+            <w:r>
+              <w:rPr>
+                <w:sz w:val="19"/>
+              </w:rPr>
+            </w:r>
             <w:r>
               <w:rPr>
                 <w:rFonts w:ascii="Arial" w:hAnsi="Arial"/>
@@ -682,16 +841,24 @@
         </w:tc>
       </w:tr>
       <w:tr>
+        <w:trPr>
+          <w:cantSplit/>
+        </w:trPr>
         <w:tc>
           <w:tcPr>
-            <w:tcW w:type="dxa" w:w="1008"/>
+            <w:tcW w:type="dxa" w:w="2"/>
             <w:vAlign w:val="center"/>
           </w:tcPr>
           <w:p>
             <w:pPr>
+              <w:spacing w:after="40"/>
               <w:jc w:val="left"/>
             </w:pPr>
-            <w:r/>
+            <w:r>
+              <w:rPr>
+                <w:sz w:val="19"/>
+              </w:rPr>
+            </w:r>
             <w:r>
               <w:rPr>
                 <w:rFonts w:ascii="Arial" w:hAnsi="Arial"/>
@@ -705,14 +872,19 @@
         </w:tc>
         <w:tc>
           <w:tcPr>
-            <w:tcW w:type="dxa" w:w="2376"/>
+            <w:tcW w:type="dxa" w:w="4"/>
             <w:vAlign w:val="center"/>
           </w:tcPr>
           <w:p>
             <w:pPr>
+              <w:spacing w:after="40"/>
               <w:jc w:val="left"/>
             </w:pPr>
-            <w:r/>
+            <w:r>
+              <w:rPr>
+                <w:sz w:val="19"/>
+              </w:rPr>
+            </w:r>
             <w:r>
               <w:rPr>
                 <w:rFonts w:ascii="Arial" w:hAnsi="Arial"/>
@@ -726,14 +898,19 @@
         </w:tc>
         <w:tc>
           <w:tcPr>
-            <w:tcW w:type="dxa" w:w="7704"/>
+            <w:tcW w:type="dxa" w:w="8"/>
             <w:vAlign w:val="center"/>
           </w:tcPr>
           <w:p>
             <w:pPr>
+              <w:spacing w:after="40"/>
               <w:jc w:val="left"/>
             </w:pPr>
-            <w:r/>
+            <w:r>
+              <w:rPr>
+                <w:sz w:val="19"/>
+              </w:rPr>
+            </w:r>
             <w:r>
               <w:rPr>
                 <w:rFonts w:ascii="Arial" w:hAnsi="Arial"/>
@@ -747,16 +924,24 @@
         </w:tc>
       </w:tr>
       <w:tr>
+        <w:trPr>
+          <w:cantSplit/>
+        </w:trPr>
         <w:tc>
           <w:tcPr>
-            <w:tcW w:type="dxa" w:w="1008"/>
+            <w:tcW w:type="dxa" w:w="2"/>
             <w:vAlign w:val="center"/>
           </w:tcPr>
           <w:p>
             <w:pPr>
+              <w:spacing w:after="40"/>
               <w:jc w:val="left"/>
             </w:pPr>
-            <w:r/>
+            <w:r>
+              <w:rPr>
+                <w:sz w:val="19"/>
+              </w:rPr>
+            </w:r>
             <w:r>
               <w:rPr>
                 <w:rFonts w:ascii="Arial" w:hAnsi="Arial"/>
@@ -770,14 +955,19 @@
         </w:tc>
         <w:tc>
           <w:tcPr>
-            <w:tcW w:type="dxa" w:w="2376"/>
+            <w:tcW w:type="dxa" w:w="4"/>
             <w:vAlign w:val="center"/>
           </w:tcPr>
           <w:p>
             <w:pPr>
+              <w:spacing w:after="40"/>
               <w:jc w:val="left"/>
             </w:pPr>
-            <w:r/>
+            <w:r>
+              <w:rPr>
+                <w:sz w:val="19"/>
+              </w:rPr>
+            </w:r>
             <w:r>
               <w:rPr>
                 <w:rFonts w:ascii="Arial" w:hAnsi="Arial"/>
@@ -791,14 +981,19 @@
         </w:tc>
         <w:tc>
           <w:tcPr>
-            <w:tcW w:type="dxa" w:w="7704"/>
+            <w:tcW w:type="dxa" w:w="8"/>
             <w:vAlign w:val="center"/>
           </w:tcPr>
           <w:p>
             <w:pPr>
+              <w:spacing w:after="40"/>
               <w:jc w:val="left"/>
             </w:pPr>
-            <w:r/>
+            <w:r>
+              <w:rPr>
+                <w:sz w:val="19"/>
+              </w:rPr>
+            </w:r>
             <w:r>
               <w:rPr>
                 <w:rFonts w:ascii="Arial" w:hAnsi="Arial"/>
@@ -812,16 +1007,24 @@
         </w:tc>
       </w:tr>
       <w:tr>
+        <w:trPr>
+          <w:cantSplit/>
+        </w:trPr>
         <w:tc>
           <w:tcPr>
-            <w:tcW w:type="dxa" w:w="1008"/>
+            <w:tcW w:type="dxa" w:w="2"/>
             <w:vAlign w:val="center"/>
           </w:tcPr>
           <w:p>
             <w:pPr>
+              <w:spacing w:after="40"/>
               <w:jc w:val="left"/>
             </w:pPr>
-            <w:r/>
+            <w:r>
+              <w:rPr>
+                <w:sz w:val="19"/>
+              </w:rPr>
+            </w:r>
             <w:r>
               <w:rPr>
                 <w:rFonts w:ascii="Arial" w:hAnsi="Arial"/>
@@ -835,14 +1038,19 @@
         </w:tc>
         <w:tc>
           <w:tcPr>
-            <w:tcW w:type="dxa" w:w="2376"/>
+            <w:tcW w:type="dxa" w:w="4"/>
             <w:vAlign w:val="center"/>
           </w:tcPr>
           <w:p>
             <w:pPr>
+              <w:spacing w:after="40"/>
               <w:jc w:val="left"/>
             </w:pPr>
-            <w:r/>
+            <w:r>
+              <w:rPr>
+                <w:sz w:val="19"/>
+              </w:rPr>
+            </w:r>
             <w:r>
               <w:rPr>
                 <w:rFonts w:ascii="Arial" w:hAnsi="Arial"/>
@@ -856,14 +1064,19 @@
         </w:tc>
         <w:tc>
           <w:tcPr>
-            <w:tcW w:type="dxa" w:w="7704"/>
+            <w:tcW w:type="dxa" w:w="8"/>
             <w:vAlign w:val="center"/>
           </w:tcPr>
           <w:p>
             <w:pPr>
+              <w:spacing w:after="40"/>
               <w:jc w:val="left"/>
             </w:pPr>
-            <w:r/>
+            <w:r>
+              <w:rPr>
+                <w:sz w:val="19"/>
+              </w:rPr>
+            </w:r>
             <w:r>
               <w:rPr>
                 <w:rFonts w:ascii="Arial" w:hAnsi="Arial"/>
@@ -877,16 +1090,24 @@
         </w:tc>
       </w:tr>
       <w:tr>
+        <w:trPr>
+          <w:cantSplit/>
+        </w:trPr>
         <w:tc>
           <w:tcPr>
-            <w:tcW w:type="dxa" w:w="1008"/>
+            <w:tcW w:type="dxa" w:w="2"/>
             <w:vAlign w:val="center"/>
           </w:tcPr>
           <w:p>
             <w:pPr>
+              <w:spacing w:after="40"/>
               <w:jc w:val="left"/>
             </w:pPr>
-            <w:r/>
+            <w:r>
+              <w:rPr>
+                <w:sz w:val="19"/>
+              </w:rPr>
+            </w:r>
             <w:r>
               <w:rPr>
                 <w:rFonts w:ascii="Arial" w:hAnsi="Arial"/>
@@ -900,14 +1121,19 @@
         </w:tc>
         <w:tc>
           <w:tcPr>
-            <w:tcW w:type="dxa" w:w="2376"/>
+            <w:tcW w:type="dxa" w:w="4"/>
             <w:vAlign w:val="center"/>
           </w:tcPr>
           <w:p>
             <w:pPr>
+              <w:spacing w:after="40"/>
               <w:jc w:val="left"/>
             </w:pPr>
-            <w:r/>
+            <w:r>
+              <w:rPr>
+                <w:sz w:val="19"/>
+              </w:rPr>
+            </w:r>
             <w:r>
               <w:rPr>
                 <w:rFonts w:ascii="Arial" w:hAnsi="Arial"/>
@@ -921,14 +1147,19 @@
         </w:tc>
         <w:tc>
           <w:tcPr>
-            <w:tcW w:type="dxa" w:w="7704"/>
+            <w:tcW w:type="dxa" w:w="8"/>
             <w:vAlign w:val="center"/>
           </w:tcPr>
           <w:p>
             <w:pPr>
+              <w:spacing w:after="40"/>
               <w:jc w:val="left"/>
             </w:pPr>
-            <w:r/>
+            <w:r>
+              <w:rPr>
+                <w:sz w:val="19"/>
+              </w:rPr>
+            </w:r>
             <w:r>
               <w:rPr>
                 <w:rFonts w:ascii="Arial" w:hAnsi="Arial"/>
@@ -942,16 +1173,24 @@
         </w:tc>
       </w:tr>
       <w:tr>
+        <w:trPr>
+          <w:cantSplit/>
+        </w:trPr>
         <w:tc>
           <w:tcPr>
-            <w:tcW w:type="dxa" w:w="1008"/>
+            <w:tcW w:type="dxa" w:w="2"/>
             <w:vAlign w:val="center"/>
           </w:tcPr>
           <w:p>
             <w:pPr>
+              <w:spacing w:after="40"/>
               <w:jc w:val="left"/>
             </w:pPr>
-            <w:r/>
+            <w:r>
+              <w:rPr>
+                <w:sz w:val="19"/>
+              </w:rPr>
+            </w:r>
             <w:r>
               <w:rPr>
                 <w:rFonts w:ascii="Arial" w:hAnsi="Arial"/>
@@ -965,14 +1204,19 @@
         </w:tc>
         <w:tc>
           <w:tcPr>
-            <w:tcW w:type="dxa" w:w="2376"/>
+            <w:tcW w:type="dxa" w:w="4"/>
             <w:vAlign w:val="center"/>
           </w:tcPr>
           <w:p>
             <w:pPr>
+              <w:spacing w:after="40"/>
               <w:jc w:val="left"/>
             </w:pPr>
-            <w:r/>
+            <w:r>
+              <w:rPr>
+                <w:sz w:val="19"/>
+              </w:rPr>
+            </w:r>
             <w:r>
               <w:rPr>
                 <w:rFonts w:ascii="Arial" w:hAnsi="Arial"/>
@@ -986,14 +1230,19 @@
         </w:tc>
         <w:tc>
           <w:tcPr>
-            <w:tcW w:type="dxa" w:w="7704"/>
+            <w:tcW w:type="dxa" w:w="8"/>
             <w:vAlign w:val="center"/>
           </w:tcPr>
           <w:p>
             <w:pPr>
+              <w:spacing w:after="40"/>
               <w:jc w:val="left"/>
             </w:pPr>
-            <w:r/>
+            <w:r>
+              <w:rPr>
+                <w:sz w:val="19"/>
+              </w:rPr>
+            </w:r>
             <w:r>
               <w:rPr>
                 <w:rFonts w:ascii="Arial" w:hAnsi="Arial"/>
@@ -1007,16 +1256,24 @@
         </w:tc>
       </w:tr>
       <w:tr>
+        <w:trPr>
+          <w:cantSplit/>
+        </w:trPr>
         <w:tc>
           <w:tcPr>
-            <w:tcW w:type="dxa" w:w="1008"/>
+            <w:tcW w:type="dxa" w:w="2"/>
             <w:vAlign w:val="center"/>
           </w:tcPr>
           <w:p>
             <w:pPr>
+              <w:spacing w:after="40"/>
               <w:jc w:val="left"/>
             </w:pPr>
-            <w:r/>
+            <w:r>
+              <w:rPr>
+                <w:sz w:val="19"/>
+              </w:rPr>
+            </w:r>
             <w:r>
               <w:rPr>
                 <w:rFonts w:ascii="Arial" w:hAnsi="Arial"/>
@@ -1030,14 +1287,19 @@
         </w:tc>
         <w:tc>
           <w:tcPr>
-            <w:tcW w:type="dxa" w:w="2376"/>
+            <w:tcW w:type="dxa" w:w="4"/>
             <w:vAlign w:val="center"/>
           </w:tcPr>
           <w:p>
             <w:pPr>
+              <w:spacing w:after="40"/>
               <w:jc w:val="left"/>
             </w:pPr>
-            <w:r/>
+            <w:r>
+              <w:rPr>
+                <w:sz w:val="19"/>
+              </w:rPr>
+            </w:r>
             <w:r>
               <w:rPr>
                 <w:rFonts w:ascii="Arial" w:hAnsi="Arial"/>
@@ -1051,14 +1313,19 @@
         </w:tc>
         <w:tc>
           <w:tcPr>
-            <w:tcW w:type="dxa" w:w="7704"/>
+            <w:tcW w:type="dxa" w:w="8"/>
             <w:vAlign w:val="center"/>
           </w:tcPr>
           <w:p>
             <w:pPr>
+              <w:spacing w:after="40"/>
               <w:jc w:val="left"/>
             </w:pPr>
-            <w:r/>
+            <w:r>
+              <w:rPr>
+                <w:sz w:val="19"/>
+              </w:rPr>
+            </w:r>
             <w:r>
               <w:rPr>
                 <w:rFonts w:ascii="Arial" w:hAnsi="Arial"/>
@@ -1072,64 +1339,112 @@
         </w:tc>
       </w:tr>
       <w:tr>
+        <w:trPr>
+          <w:cantSplit/>
+        </w:trPr>
         <w:tc>
           <w:tcPr>
-            <w:tcW w:type="dxa" w:w="3312"/>
+            <w:tcW w:type="dxa" w:w="2"/>
+            <w:vAlign w:val="center"/>
           </w:tcPr>
           <w:p>
-            <w:r>
+            <w:pPr>
+              <w:spacing w:after="40"/>
+            </w:pPr>
+            <w:r>
+              <w:rPr>
+                <w:sz w:val="19"/>
+              </w:rPr>
               <w:t>BF-11</w:t>
             </w:r>
           </w:p>
         </w:tc>
         <w:tc>
           <w:tcPr>
-            <w:tcW w:type="dxa" w:w="3312"/>
+            <w:tcW w:type="dxa" w:w="4"/>
+            <w:vAlign w:val="center"/>
           </w:tcPr>
           <w:p>
-            <w:r>
+            <w:pPr>
+              <w:spacing w:after="40"/>
+            </w:pPr>
+            <w:r>
+              <w:rPr>
+                <w:sz w:val="19"/>
+              </w:rPr>
               <w:t>Assistant IA</w:t>
             </w:r>
           </w:p>
         </w:tc>
         <w:tc>
           <w:tcPr>
-            <w:tcW w:type="dxa" w:w="3312"/>
+            <w:tcW w:type="dxa" w:w="8"/>
+            <w:vAlign w:val="center"/>
           </w:tcPr>
           <w:p>
-            <w:r>
+            <w:pPr>
+              <w:spacing w:after="40"/>
+            </w:pPr>
+            <w:r>
+              <w:rPr>
+                <w:sz w:val="19"/>
+              </w:rPr>
               <w:t>Générer automatiquement une description contractuelle détaillée à partir des champs du contrat, via Gemini.</w:t>
             </w:r>
           </w:p>
         </w:tc>
       </w:tr>
       <w:tr>
+        <w:trPr>
+          <w:cantSplit/>
+        </w:trPr>
         <w:tc>
           <w:tcPr>
-            <w:tcW w:type="dxa" w:w="3312"/>
+            <w:tcW w:type="dxa" w:w="2"/>
+            <w:vAlign w:val="center"/>
           </w:tcPr>
           <w:p>
-            <w:r>
+            <w:pPr>
+              <w:spacing w:after="40"/>
+            </w:pPr>
+            <w:r>
+              <w:rPr>
+                <w:sz w:val="19"/>
+              </w:rPr>
               <w:t>BF-12</w:t>
             </w:r>
           </w:p>
         </w:tc>
         <w:tc>
           <w:tcPr>
-            <w:tcW w:type="dxa" w:w="3312"/>
+            <w:tcW w:type="dxa" w:w="4"/>
+            <w:vAlign w:val="center"/>
           </w:tcPr>
           <w:p>
-            <w:r>
+            <w:pPr>
+              <w:spacing w:after="40"/>
+            </w:pPr>
+            <w:r>
+              <w:rPr>
+                <w:sz w:val="19"/>
+              </w:rPr>
               <w:t>PDF multi-pages</w:t>
             </w:r>
           </w:p>
         </w:tc>
         <w:tc>
           <w:tcPr>
-            <w:tcW w:type="dxa" w:w="3312"/>
+            <w:tcW w:type="dxa" w:w="8"/>
+            <w:vAlign w:val="center"/>
           </w:tcPr>
           <w:p>
-            <w:r>
+            <w:pPr>
+              <w:spacing w:after="40"/>
+            </w:pPr>
+            <w:r>
+              <w:rPr>
+                <w:sz w:val="19"/>
+              </w:rPr>
               <w:t>Produire un PDF complet lorsque la description est longue, avec pagination et paragraphes lisibles.</w:t>
             </w:r>
           </w:p>
@@ -1148,28 +1463,37 @@
     <w:tbl>
       <w:tblPr>
         <w:tblStyle w:val="TableGrid"/>
-        <w:tblW w:type="auto" w:w="0"/>
-        <w:jc w:val="left"/>
+        <w:tblW w:type="dxa" w:w="9000"/>
+        <w:jc w:val="center"/>
         <w:tblLayout w:type="fixed"/>
         <w:tblLook w:firstColumn="1" w:firstRow="1" w:lastColumn="0" w:lastRow="0" w:noHBand="0" w:noVBand="1" w:val="04A0"/>
       </w:tblPr>
       <w:tblGrid>
-        <w:gridCol w:w="3312"/>
-        <w:gridCol w:w="3312"/>
-        <w:gridCol w:w="3312"/>
+        <w:gridCol w:w="1250"/>
+        <w:gridCol w:w="2400"/>
+        <w:gridCol w:w="5350"/>
       </w:tblGrid>
       <w:tr>
+        <w:trPr>
+          <w:cantSplit/>
+          <w:tblHeader w:val="true"/>
+        </w:trPr>
         <w:tc>
           <w:tcPr>
-            <w:tcW w:type="dxa" w:w="1152"/>
+            <w:tcW w:type="dxa" w:w="2"/>
             <w:vAlign w:val="center"/>
             <w:shd w:fill="E2E8F0"/>
           </w:tcPr>
           <w:p>
             <w:pPr>
+              <w:spacing w:after="40"/>
               <w:jc w:val="left"/>
             </w:pPr>
-            <w:r/>
+            <w:r>
+              <w:rPr>
+                <w:sz w:val="19"/>
+              </w:rPr>
+            </w:r>
             <w:r>
               <w:rPr>
                 <w:rFonts w:ascii="Arial" w:hAnsi="Arial"/>
@@ -1183,15 +1507,20 @@
         </w:tc>
         <w:tc>
           <w:tcPr>
-            <w:tcW w:type="dxa" w:w="2304"/>
+            <w:tcW w:type="dxa" w:w="4"/>
             <w:vAlign w:val="center"/>
             <w:shd w:fill="E2E8F0"/>
           </w:tcPr>
           <w:p>
             <w:pPr>
+              <w:spacing w:after="40"/>
               <w:jc w:val="left"/>
             </w:pPr>
-            <w:r/>
+            <w:r>
+              <w:rPr>
+                <w:sz w:val="19"/>
+              </w:rPr>
+            </w:r>
             <w:r>
               <w:rPr>
                 <w:rFonts w:ascii="Arial" w:hAnsi="Arial"/>
@@ -1205,15 +1534,20 @@
         </w:tc>
         <w:tc>
           <w:tcPr>
-            <w:tcW w:type="dxa" w:w="7632"/>
+            <w:tcW w:type="dxa" w:w="8"/>
             <w:vAlign w:val="center"/>
             <w:shd w:fill="E2E8F0"/>
           </w:tcPr>
           <w:p>
             <w:pPr>
+              <w:spacing w:after="40"/>
               <w:jc w:val="left"/>
             </w:pPr>
-            <w:r/>
+            <w:r>
+              <w:rPr>
+                <w:sz w:val="19"/>
+              </w:rPr>
+            </w:r>
             <w:r>
               <w:rPr>
                 <w:rFonts w:ascii="Arial" w:hAnsi="Arial"/>
@@ -1227,16 +1561,24 @@
         </w:tc>
       </w:tr>
       <w:tr>
+        <w:trPr>
+          <w:cantSplit/>
+        </w:trPr>
         <w:tc>
           <w:tcPr>
-            <w:tcW w:type="dxa" w:w="1152"/>
+            <w:tcW w:type="dxa" w:w="2"/>
             <w:vAlign w:val="center"/>
           </w:tcPr>
           <w:p>
             <w:pPr>
+              <w:spacing w:after="40"/>
               <w:jc w:val="left"/>
             </w:pPr>
-            <w:r/>
+            <w:r>
+              <w:rPr>
+                <w:sz w:val="19"/>
+              </w:rPr>
+            </w:r>
             <w:r>
               <w:rPr>
                 <w:rFonts w:ascii="Arial" w:hAnsi="Arial"/>
@@ -1250,14 +1592,19 @@
         </w:tc>
         <w:tc>
           <w:tcPr>
-            <w:tcW w:type="dxa" w:w="2304"/>
+            <w:tcW w:type="dxa" w:w="4"/>
             <w:vAlign w:val="center"/>
           </w:tcPr>
           <w:p>
             <w:pPr>
+              <w:spacing w:after="40"/>
               <w:jc w:val="left"/>
             </w:pPr>
-            <w:r/>
+            <w:r>
+              <w:rPr>
+                <w:sz w:val="19"/>
+              </w:rPr>
+            </w:r>
             <w:r>
               <w:rPr>
                 <w:rFonts w:ascii="Arial" w:hAnsi="Arial"/>
@@ -1271,14 +1618,19 @@
         </w:tc>
         <w:tc>
           <w:tcPr>
-            <w:tcW w:type="dxa" w:w="7632"/>
+            <w:tcW w:type="dxa" w:w="8"/>
             <w:vAlign w:val="center"/>
           </w:tcPr>
           <w:p>
             <w:pPr>
+              <w:spacing w:after="40"/>
               <w:jc w:val="left"/>
             </w:pPr>
-            <w:r/>
+            <w:r>
+              <w:rPr>
+                <w:sz w:val="19"/>
+              </w:rPr>
+            </w:r>
             <w:r>
               <w:rPr>
                 <w:rFonts w:ascii="Arial" w:hAnsi="Arial"/>
@@ -1292,16 +1644,24 @@
         </w:tc>
       </w:tr>
       <w:tr>
+        <w:trPr>
+          <w:cantSplit/>
+        </w:trPr>
         <w:tc>
           <w:tcPr>
-            <w:tcW w:type="dxa" w:w="1152"/>
+            <w:tcW w:type="dxa" w:w="2"/>
             <w:vAlign w:val="center"/>
           </w:tcPr>
           <w:p>
             <w:pPr>
+              <w:spacing w:after="40"/>
               <w:jc w:val="left"/>
             </w:pPr>
-            <w:r/>
+            <w:r>
+              <w:rPr>
+                <w:sz w:val="19"/>
+              </w:rPr>
+            </w:r>
             <w:r>
               <w:rPr>
                 <w:rFonts w:ascii="Arial" w:hAnsi="Arial"/>
@@ -1315,14 +1675,19 @@
         </w:tc>
         <w:tc>
           <w:tcPr>
-            <w:tcW w:type="dxa" w:w="2304"/>
+            <w:tcW w:type="dxa" w:w="4"/>
             <w:vAlign w:val="center"/>
           </w:tcPr>
           <w:p>
             <w:pPr>
+              <w:spacing w:after="40"/>
               <w:jc w:val="left"/>
             </w:pPr>
-            <w:r/>
+            <w:r>
+              <w:rPr>
+                <w:sz w:val="19"/>
+              </w:rPr>
+            </w:r>
             <w:r>
               <w:rPr>
                 <w:rFonts w:ascii="Arial" w:hAnsi="Arial"/>
@@ -1336,14 +1701,19 @@
         </w:tc>
         <w:tc>
           <w:tcPr>
-            <w:tcW w:type="dxa" w:w="7632"/>
+            <w:tcW w:type="dxa" w:w="8"/>
             <w:vAlign w:val="center"/>
           </w:tcPr>
           <w:p>
             <w:pPr>
+              <w:spacing w:after="40"/>
               <w:jc w:val="left"/>
             </w:pPr>
-            <w:r/>
+            <w:r>
+              <w:rPr>
+                <w:sz w:val="19"/>
+              </w:rPr>
+            </w:r>
             <w:r>
               <w:rPr>
                 <w:rFonts w:ascii="Arial" w:hAnsi="Arial"/>
@@ -1357,16 +1727,24 @@
         </w:tc>
       </w:tr>
       <w:tr>
+        <w:trPr>
+          <w:cantSplit/>
+        </w:trPr>
         <w:tc>
           <w:tcPr>
-            <w:tcW w:type="dxa" w:w="1152"/>
+            <w:tcW w:type="dxa" w:w="2"/>
             <w:vAlign w:val="center"/>
           </w:tcPr>
           <w:p>
             <w:pPr>
+              <w:spacing w:after="40"/>
               <w:jc w:val="left"/>
             </w:pPr>
-            <w:r/>
+            <w:r>
+              <w:rPr>
+                <w:sz w:val="19"/>
+              </w:rPr>
+            </w:r>
             <w:r>
               <w:rPr>
                 <w:rFonts w:ascii="Arial" w:hAnsi="Arial"/>
@@ -1380,14 +1758,19 @@
         </w:tc>
         <w:tc>
           <w:tcPr>
-            <w:tcW w:type="dxa" w:w="2304"/>
+            <w:tcW w:type="dxa" w:w="4"/>
             <w:vAlign w:val="center"/>
           </w:tcPr>
           <w:p>
             <w:pPr>
+              <w:spacing w:after="40"/>
               <w:jc w:val="left"/>
             </w:pPr>
-            <w:r/>
+            <w:r>
+              <w:rPr>
+                <w:sz w:val="19"/>
+              </w:rPr>
+            </w:r>
             <w:r>
               <w:rPr>
                 <w:rFonts w:ascii="Arial" w:hAnsi="Arial"/>
@@ -1401,14 +1784,19 @@
         </w:tc>
         <w:tc>
           <w:tcPr>
-            <w:tcW w:type="dxa" w:w="7632"/>
+            <w:tcW w:type="dxa" w:w="8"/>
             <w:vAlign w:val="center"/>
           </w:tcPr>
           <w:p>
             <w:pPr>
+              <w:spacing w:after="40"/>
               <w:jc w:val="left"/>
             </w:pPr>
-            <w:r/>
+            <w:r>
+              <w:rPr>
+                <w:sz w:val="19"/>
+              </w:rPr>
+            </w:r>
             <w:r>
               <w:rPr>
                 <w:rFonts w:ascii="Arial" w:hAnsi="Arial"/>
@@ -1422,16 +1810,24 @@
         </w:tc>
       </w:tr>
       <w:tr>
+        <w:trPr>
+          <w:cantSplit/>
+        </w:trPr>
         <w:tc>
           <w:tcPr>
-            <w:tcW w:type="dxa" w:w="1152"/>
+            <w:tcW w:type="dxa" w:w="2"/>
             <w:vAlign w:val="center"/>
           </w:tcPr>
           <w:p>
             <w:pPr>
+              <w:spacing w:after="40"/>
               <w:jc w:val="left"/>
             </w:pPr>
-            <w:r/>
+            <w:r>
+              <w:rPr>
+                <w:sz w:val="19"/>
+              </w:rPr>
+            </w:r>
             <w:r>
               <w:rPr>
                 <w:rFonts w:ascii="Arial" w:hAnsi="Arial"/>
@@ -1445,14 +1841,19 @@
         </w:tc>
         <w:tc>
           <w:tcPr>
-            <w:tcW w:type="dxa" w:w="2304"/>
+            <w:tcW w:type="dxa" w:w="4"/>
             <w:vAlign w:val="center"/>
           </w:tcPr>
           <w:p>
             <w:pPr>
+              <w:spacing w:after="40"/>
               <w:jc w:val="left"/>
             </w:pPr>
-            <w:r/>
+            <w:r>
+              <w:rPr>
+                <w:sz w:val="19"/>
+              </w:rPr>
+            </w:r>
             <w:r>
               <w:rPr>
                 <w:rFonts w:ascii="Arial" w:hAnsi="Arial"/>
@@ -1466,14 +1867,19 @@
         </w:tc>
         <w:tc>
           <w:tcPr>
-            <w:tcW w:type="dxa" w:w="7632"/>
+            <w:tcW w:type="dxa" w:w="8"/>
             <w:vAlign w:val="center"/>
           </w:tcPr>
           <w:p>
             <w:pPr>
+              <w:spacing w:after="40"/>
               <w:jc w:val="left"/>
             </w:pPr>
-            <w:r/>
+            <w:r>
+              <w:rPr>
+                <w:sz w:val="19"/>
+              </w:rPr>
+            </w:r>
             <w:r>
               <w:rPr>
                 <w:rFonts w:ascii="Arial" w:hAnsi="Arial"/>
@@ -1487,16 +1893,24 @@
         </w:tc>
       </w:tr>
       <w:tr>
+        <w:trPr>
+          <w:cantSplit/>
+        </w:trPr>
         <w:tc>
           <w:tcPr>
-            <w:tcW w:type="dxa" w:w="1152"/>
+            <w:tcW w:type="dxa" w:w="2"/>
             <w:vAlign w:val="center"/>
           </w:tcPr>
           <w:p>
             <w:pPr>
+              <w:spacing w:after="40"/>
               <w:jc w:val="left"/>
             </w:pPr>
-            <w:r/>
+            <w:r>
+              <w:rPr>
+                <w:sz w:val="19"/>
+              </w:rPr>
+            </w:r>
             <w:r>
               <w:rPr>
                 <w:rFonts w:ascii="Arial" w:hAnsi="Arial"/>
@@ -1510,14 +1924,19 @@
         </w:tc>
         <w:tc>
           <w:tcPr>
-            <w:tcW w:type="dxa" w:w="2304"/>
+            <w:tcW w:type="dxa" w:w="4"/>
             <w:vAlign w:val="center"/>
           </w:tcPr>
           <w:p>
             <w:pPr>
+              <w:spacing w:after="40"/>
               <w:jc w:val="left"/>
             </w:pPr>
-            <w:r/>
+            <w:r>
+              <w:rPr>
+                <w:sz w:val="19"/>
+              </w:rPr>
+            </w:r>
             <w:r>
               <w:rPr>
                 <w:rFonts w:ascii="Arial" w:hAnsi="Arial"/>
@@ -1531,14 +1950,19 @@
         </w:tc>
         <w:tc>
           <w:tcPr>
-            <w:tcW w:type="dxa" w:w="7632"/>
+            <w:tcW w:type="dxa" w:w="8"/>
             <w:vAlign w:val="center"/>
           </w:tcPr>
           <w:p>
             <w:pPr>
+              <w:spacing w:after="40"/>
               <w:jc w:val="left"/>
             </w:pPr>
-            <w:r/>
+            <w:r>
+              <w:rPr>
+                <w:sz w:val="19"/>
+              </w:rPr>
+            </w:r>
             <w:r>
               <w:rPr>
                 <w:rFonts w:ascii="Arial" w:hAnsi="Arial"/>
@@ -1552,16 +1976,24 @@
         </w:tc>
       </w:tr>
       <w:tr>
+        <w:trPr>
+          <w:cantSplit/>
+        </w:trPr>
         <w:tc>
           <w:tcPr>
-            <w:tcW w:type="dxa" w:w="1152"/>
+            <w:tcW w:type="dxa" w:w="2"/>
             <w:vAlign w:val="center"/>
           </w:tcPr>
           <w:p>
             <w:pPr>
+              <w:spacing w:after="40"/>
               <w:jc w:val="left"/>
             </w:pPr>
-            <w:r/>
+            <w:r>
+              <w:rPr>
+                <w:sz w:val="19"/>
+              </w:rPr>
+            </w:r>
             <w:r>
               <w:rPr>
                 <w:rFonts w:ascii="Arial" w:hAnsi="Arial"/>
@@ -1575,14 +2007,19 @@
         </w:tc>
         <w:tc>
           <w:tcPr>
-            <w:tcW w:type="dxa" w:w="2304"/>
+            <w:tcW w:type="dxa" w:w="4"/>
             <w:vAlign w:val="center"/>
           </w:tcPr>
           <w:p>
             <w:pPr>
+              <w:spacing w:after="40"/>
               <w:jc w:val="left"/>
             </w:pPr>
-            <w:r/>
+            <w:r>
+              <w:rPr>
+                <w:sz w:val="19"/>
+              </w:rPr>
+            </w:r>
             <w:r>
               <w:rPr>
                 <w:rFonts w:ascii="Arial" w:hAnsi="Arial"/>
@@ -1596,14 +2033,19 @@
         </w:tc>
         <w:tc>
           <w:tcPr>
-            <w:tcW w:type="dxa" w:w="7632"/>
+            <w:tcW w:type="dxa" w:w="8"/>
             <w:vAlign w:val="center"/>
           </w:tcPr>
           <w:p>
             <w:pPr>
+              <w:spacing w:after="40"/>
               <w:jc w:val="left"/>
             </w:pPr>
-            <w:r/>
+            <w:r>
+              <w:rPr>
+                <w:sz w:val="19"/>
+              </w:rPr>
+            </w:r>
             <w:r>
               <w:rPr>
                 <w:rFonts w:ascii="Arial" w:hAnsi="Arial"/>
@@ -1617,16 +2059,24 @@
         </w:tc>
       </w:tr>
       <w:tr>
+        <w:trPr>
+          <w:cantSplit/>
+        </w:trPr>
         <w:tc>
           <w:tcPr>
-            <w:tcW w:type="dxa" w:w="1152"/>
+            <w:tcW w:type="dxa" w:w="2"/>
             <w:vAlign w:val="center"/>
           </w:tcPr>
           <w:p>
             <w:pPr>
+              <w:spacing w:after="40"/>
               <w:jc w:val="left"/>
             </w:pPr>
-            <w:r/>
+            <w:r>
+              <w:rPr>
+                <w:sz w:val="19"/>
+              </w:rPr>
+            </w:r>
             <w:r>
               <w:rPr>
                 <w:rFonts w:ascii="Arial" w:hAnsi="Arial"/>
@@ -1640,14 +2090,19 @@
         </w:tc>
         <w:tc>
           <w:tcPr>
-            <w:tcW w:type="dxa" w:w="2304"/>
+            <w:tcW w:type="dxa" w:w="4"/>
             <w:vAlign w:val="center"/>
           </w:tcPr>
           <w:p>
             <w:pPr>
+              <w:spacing w:after="40"/>
               <w:jc w:val="left"/>
             </w:pPr>
-            <w:r/>
+            <w:r>
+              <w:rPr>
+                <w:sz w:val="19"/>
+              </w:rPr>
+            </w:r>
             <w:r>
               <w:rPr>
                 <w:rFonts w:ascii="Arial" w:hAnsi="Arial"/>
@@ -1661,14 +2116,19 @@
         </w:tc>
         <w:tc>
           <w:tcPr>
-            <w:tcW w:type="dxa" w:w="7632"/>
+            <w:tcW w:type="dxa" w:w="8"/>
             <w:vAlign w:val="center"/>
           </w:tcPr>
           <w:p>
             <w:pPr>
+              <w:spacing w:after="40"/>
               <w:jc w:val="left"/>
             </w:pPr>
-            <w:r/>
+            <w:r>
+              <w:rPr>
+                <w:sz w:val="19"/>
+              </w:rPr>
+            </w:r>
             <w:r>
               <w:rPr>
                 <w:rFonts w:ascii="Arial" w:hAnsi="Arial"/>
@@ -1682,16 +2142,24 @@
         </w:tc>
       </w:tr>
       <w:tr>
+        <w:trPr>
+          <w:cantSplit/>
+        </w:trPr>
         <w:tc>
           <w:tcPr>
-            <w:tcW w:type="dxa" w:w="1152"/>
+            <w:tcW w:type="dxa" w:w="2"/>
             <w:vAlign w:val="center"/>
           </w:tcPr>
           <w:p>
             <w:pPr>
+              <w:spacing w:after="40"/>
               <w:jc w:val="left"/>
             </w:pPr>
-            <w:r/>
+            <w:r>
+              <w:rPr>
+                <w:sz w:val="19"/>
+              </w:rPr>
+            </w:r>
             <w:r>
               <w:rPr>
                 <w:rFonts w:ascii="Arial" w:hAnsi="Arial"/>
@@ -1705,14 +2173,19 @@
         </w:tc>
         <w:tc>
           <w:tcPr>
-            <w:tcW w:type="dxa" w:w="2304"/>
+            <w:tcW w:type="dxa" w:w="4"/>
             <w:vAlign w:val="center"/>
           </w:tcPr>
           <w:p>
             <w:pPr>
+              <w:spacing w:after="40"/>
               <w:jc w:val="left"/>
             </w:pPr>
-            <w:r/>
+            <w:r>
+              <w:rPr>
+                <w:sz w:val="19"/>
+              </w:rPr>
+            </w:r>
             <w:r>
               <w:rPr>
                 <w:rFonts w:ascii="Arial" w:hAnsi="Arial"/>
@@ -1726,14 +2199,19 @@
         </w:tc>
         <w:tc>
           <w:tcPr>
-            <w:tcW w:type="dxa" w:w="7632"/>
+            <w:tcW w:type="dxa" w:w="8"/>
             <w:vAlign w:val="center"/>
           </w:tcPr>
           <w:p>
             <w:pPr>
+              <w:spacing w:after="40"/>
               <w:jc w:val="left"/>
             </w:pPr>
-            <w:r/>
+            <w:r>
+              <w:rPr>
+                <w:sz w:val="19"/>
+              </w:rPr>
+            </w:r>
             <w:r>
               <w:rPr>
                 <w:rFonts w:ascii="Arial" w:hAnsi="Arial"/>
@@ -1747,64 +2225,112 @@
         </w:tc>
       </w:tr>
       <w:tr>
+        <w:trPr>
+          <w:cantSplit/>
+        </w:trPr>
         <w:tc>
           <w:tcPr>
-            <w:tcW w:type="dxa" w:w="3312"/>
+            <w:tcW w:type="dxa" w:w="2"/>
+            <w:vAlign w:val="center"/>
           </w:tcPr>
           <w:p>
-            <w:r>
+            <w:pPr>
+              <w:spacing w:after="40"/>
+            </w:pPr>
+            <w:r>
+              <w:rPr>
+                <w:sz w:val="19"/>
+              </w:rPr>
               <w:t>BNF-09</w:t>
             </w:r>
           </w:p>
         </w:tc>
         <w:tc>
           <w:tcPr>
-            <w:tcW w:type="dxa" w:w="3312"/>
+            <w:tcW w:type="dxa" w:w="4"/>
+            <w:vAlign w:val="center"/>
           </w:tcPr>
           <w:p>
-            <w:r>
+            <w:pPr>
+              <w:spacing w:after="40"/>
+            </w:pPr>
+            <w:r>
+              <w:rPr>
+                <w:sz w:val="19"/>
+              </w:rPr>
               <w:t>Sécurité IA</w:t>
             </w:r>
           </w:p>
         </w:tc>
         <w:tc>
           <w:tcPr>
-            <w:tcW w:type="dxa" w:w="3312"/>
+            <w:tcW w:type="dxa" w:w="8"/>
+            <w:vAlign w:val="center"/>
           </w:tcPr>
           <w:p>
-            <w:r>
+            <w:pPr>
+              <w:spacing w:after="40"/>
+            </w:pPr>
+            <w:r>
+              <w:rPr>
+                <w:sz w:val="19"/>
+              </w:rPr>
               <w:t>La clé Gemini reste côté backend/Railway et n'est jamais exposée au frontend.</w:t>
             </w:r>
           </w:p>
         </w:tc>
       </w:tr>
       <w:tr>
+        <w:trPr>
+          <w:cantSplit/>
+        </w:trPr>
         <w:tc>
           <w:tcPr>
-            <w:tcW w:type="dxa" w:w="3312"/>
+            <w:tcW w:type="dxa" w:w="2"/>
+            <w:vAlign w:val="center"/>
           </w:tcPr>
           <w:p>
-            <w:r>
+            <w:pPr>
+              <w:spacing w:after="40"/>
+            </w:pPr>
+            <w:r>
+              <w:rPr>
+                <w:sz w:val="19"/>
+              </w:rPr>
               <w:t>BNF-10</w:t>
             </w:r>
           </w:p>
         </w:tc>
         <w:tc>
           <w:tcPr>
-            <w:tcW w:type="dxa" w:w="3312"/>
+            <w:tcW w:type="dxa" w:w="4"/>
+            <w:vAlign w:val="center"/>
           </w:tcPr>
           <w:p>
-            <w:r>
+            <w:pPr>
+              <w:spacing w:after="40"/>
+            </w:pPr>
+            <w:r>
+              <w:rPr>
+                <w:sz w:val="19"/>
+              </w:rPr>
               <w:t>Compatibilité quota</w:t>
             </w:r>
           </w:p>
         </w:tc>
         <w:tc>
           <w:tcPr>
-            <w:tcW w:type="dxa" w:w="3312"/>
+            <w:tcW w:type="dxa" w:w="8"/>
+            <w:vAlign w:val="center"/>
           </w:tcPr>
           <w:p>
-            <w:r>
+            <w:pPr>
+              <w:spacing w:after="40"/>
+            </w:pPr>
+            <w:r>
+              <w:rPr>
+                <w:sz w:val="19"/>
+              </w:rPr>
               <w:t>L'appel IA est limité à une seule requête Gemini par génération afin de rester compatible avec les limites du free tier.</w:t>
             </w:r>
           </w:p>
@@ -1828,28 +2354,37 @@
     <w:tbl>
       <w:tblPr>
         <w:tblStyle w:val="TableGrid"/>
-        <w:tblW w:type="auto" w:w="0"/>
-        <w:jc w:val="left"/>
+        <w:tblW w:type="dxa" w:w="9000"/>
+        <w:jc w:val="center"/>
         <w:tblLayout w:type="fixed"/>
         <w:tblLook w:firstColumn="1" w:firstRow="1" w:lastColumn="0" w:lastRow="0" w:noHBand="0" w:noVBand="1" w:val="04A0"/>
       </w:tblPr>
       <w:tblGrid>
-        <w:gridCol w:w="3312"/>
-        <w:gridCol w:w="3312"/>
-        <w:gridCol w:w="3312"/>
+        <w:gridCol w:w="1800"/>
+        <w:gridCol w:w="2700"/>
+        <w:gridCol w:w="4500"/>
       </w:tblGrid>
       <w:tr>
+        <w:trPr>
+          <w:cantSplit/>
+          <w:tblHeader w:val="true"/>
+        </w:trPr>
         <w:tc>
           <w:tcPr>
-            <w:tcW w:type="dxa" w:w="1728"/>
+            <w:tcW w:type="dxa" w:w="3"/>
             <w:vAlign w:val="center"/>
             <w:shd w:fill="E2E8F0"/>
           </w:tcPr>
           <w:p>
             <w:pPr>
+              <w:spacing w:after="40"/>
               <w:jc w:val="left"/>
             </w:pPr>
-            <w:r/>
+            <w:r>
+              <w:rPr>
+                <w:sz w:val="19"/>
+              </w:rPr>
+            </w:r>
             <w:r>
               <w:rPr>
                 <w:rFonts w:ascii="Arial" w:hAnsi="Arial"/>
@@ -1863,15 +2398,20 @@
         </w:tc>
         <w:tc>
           <w:tcPr>
-            <w:tcW w:type="dxa" w:w="4032"/>
+            <w:tcW w:type="dxa" w:w="4"/>
             <w:vAlign w:val="center"/>
             <w:shd w:fill="E2E8F0"/>
           </w:tcPr>
           <w:p>
             <w:pPr>
+              <w:spacing w:after="40"/>
               <w:jc w:val="left"/>
             </w:pPr>
-            <w:r/>
+            <w:r>
+              <w:rPr>
+                <w:sz w:val="19"/>
+              </w:rPr>
+            </w:r>
             <w:r>
               <w:rPr>
                 <w:rFonts w:ascii="Arial" w:hAnsi="Arial"/>
@@ -1885,15 +2425,20 @@
         </w:tc>
         <w:tc>
           <w:tcPr>
-            <w:tcW w:type="dxa" w:w="5328"/>
+            <w:tcW w:type="dxa" w:w="7"/>
             <w:vAlign w:val="center"/>
             <w:shd w:fill="E2E8F0"/>
           </w:tcPr>
           <w:p>
             <w:pPr>
+              <w:spacing w:after="40"/>
               <w:jc w:val="left"/>
             </w:pPr>
-            <w:r/>
+            <w:r>
+              <w:rPr>
+                <w:sz w:val="19"/>
+              </w:rPr>
+            </w:r>
             <w:r>
               <w:rPr>
                 <w:rFonts w:ascii="Arial" w:hAnsi="Arial"/>
@@ -1907,16 +2452,24 @@
         </w:tc>
       </w:tr>
       <w:tr>
+        <w:trPr>
+          <w:cantSplit/>
+        </w:trPr>
         <w:tc>
           <w:tcPr>
-            <w:tcW w:type="dxa" w:w="1728"/>
+            <w:tcW w:type="dxa" w:w="3"/>
             <w:vAlign w:val="center"/>
           </w:tcPr>
           <w:p>
             <w:pPr>
+              <w:spacing w:after="40"/>
               <w:jc w:val="left"/>
             </w:pPr>
-            <w:r/>
+            <w:r>
+              <w:rPr>
+                <w:sz w:val="19"/>
+              </w:rPr>
+            </w:r>
             <w:r>
               <w:rPr>
                 <w:rFonts w:ascii="Arial" w:hAnsi="Arial"/>
@@ -1930,14 +2483,19 @@
         </w:tc>
         <w:tc>
           <w:tcPr>
-            <w:tcW w:type="dxa" w:w="4032"/>
+            <w:tcW w:type="dxa" w:w="4"/>
             <w:vAlign w:val="center"/>
           </w:tcPr>
           <w:p>
             <w:pPr>
+              <w:spacing w:after="40"/>
               <w:jc w:val="left"/>
             </w:pPr>
-            <w:r/>
+            <w:r>
+              <w:rPr>
+                <w:sz w:val="19"/>
+              </w:rPr>
+            </w:r>
             <w:r>
               <w:rPr>
                 <w:rFonts w:ascii="Arial" w:hAnsi="Arial"/>
@@ -1951,14 +2509,19 @@
         </w:tc>
         <w:tc>
           <w:tcPr>
-            <w:tcW w:type="dxa" w:w="5328"/>
+            <w:tcW w:type="dxa" w:w="7"/>
             <w:vAlign w:val="center"/>
           </w:tcPr>
           <w:p>
             <w:pPr>
+              <w:spacing w:after="40"/>
               <w:jc w:val="left"/>
             </w:pPr>
-            <w:r/>
+            <w:r>
+              <w:rPr>
+                <w:sz w:val="19"/>
+              </w:rPr>
+            </w:r>
             <w:r>
               <w:rPr>
                 <w:rFonts w:ascii="Arial" w:hAnsi="Arial"/>
@@ -1972,16 +2535,24 @@
         </w:tc>
       </w:tr>
       <w:tr>
+        <w:trPr>
+          <w:cantSplit/>
+        </w:trPr>
         <w:tc>
           <w:tcPr>
-            <w:tcW w:type="dxa" w:w="1728"/>
+            <w:tcW w:type="dxa" w:w="3"/>
             <w:vAlign w:val="center"/>
           </w:tcPr>
           <w:p>
             <w:pPr>
+              <w:spacing w:after="40"/>
               <w:jc w:val="left"/>
             </w:pPr>
-            <w:r/>
+            <w:r>
+              <w:rPr>
+                <w:sz w:val="19"/>
+              </w:rPr>
+            </w:r>
             <w:r>
               <w:rPr>
                 <w:rFonts w:ascii="Arial" w:hAnsi="Arial"/>
@@ -1995,14 +2566,19 @@
         </w:tc>
         <w:tc>
           <w:tcPr>
-            <w:tcW w:type="dxa" w:w="4032"/>
+            <w:tcW w:type="dxa" w:w="4"/>
             <w:vAlign w:val="center"/>
           </w:tcPr>
           <w:p>
             <w:pPr>
+              <w:spacing w:after="40"/>
               <w:jc w:val="left"/>
             </w:pPr>
-            <w:r/>
+            <w:r>
+              <w:rPr>
+                <w:sz w:val="19"/>
+              </w:rPr>
+            </w:r>
             <w:r>
               <w:rPr>
                 <w:rFonts w:ascii="Arial" w:hAnsi="Arial"/>
@@ -2016,14 +2592,19 @@
         </w:tc>
         <w:tc>
           <w:tcPr>
-            <w:tcW w:type="dxa" w:w="5328"/>
+            <w:tcW w:type="dxa" w:w="7"/>
             <w:vAlign w:val="center"/>
           </w:tcPr>
           <w:p>
             <w:pPr>
+              <w:spacing w:after="40"/>
               <w:jc w:val="left"/>
             </w:pPr>
-            <w:r/>
+            <w:r>
+              <w:rPr>
+                <w:sz w:val="19"/>
+              </w:rPr>
+            </w:r>
             <w:r>
               <w:rPr>
                 <w:rFonts w:ascii="Arial" w:hAnsi="Arial"/>
@@ -2037,16 +2618,24 @@
         </w:tc>
       </w:tr>
       <w:tr>
+        <w:trPr>
+          <w:cantSplit/>
+        </w:trPr>
         <w:tc>
           <w:tcPr>
-            <w:tcW w:type="dxa" w:w="1728"/>
+            <w:tcW w:type="dxa" w:w="3"/>
             <w:vAlign w:val="center"/>
           </w:tcPr>
           <w:p>
             <w:pPr>
+              <w:spacing w:after="40"/>
               <w:jc w:val="left"/>
             </w:pPr>
-            <w:r/>
+            <w:r>
+              <w:rPr>
+                <w:sz w:val="19"/>
+              </w:rPr>
+            </w:r>
             <w:r>
               <w:rPr>
                 <w:rFonts w:ascii="Arial" w:hAnsi="Arial"/>
@@ -2060,14 +2649,19 @@
         </w:tc>
         <w:tc>
           <w:tcPr>
-            <w:tcW w:type="dxa" w:w="4032"/>
+            <w:tcW w:type="dxa" w:w="4"/>
             <w:vAlign w:val="center"/>
           </w:tcPr>
           <w:p>
             <w:pPr>
+              <w:spacing w:after="40"/>
               <w:jc w:val="left"/>
             </w:pPr>
-            <w:r/>
+            <w:r>
+              <w:rPr>
+                <w:sz w:val="19"/>
+              </w:rPr>
+            </w:r>
             <w:r>
               <w:rPr>
                 <w:rFonts w:ascii="Arial" w:hAnsi="Arial"/>
@@ -2081,14 +2675,19 @@
         </w:tc>
         <w:tc>
           <w:tcPr>
-            <w:tcW w:type="dxa" w:w="5328"/>
+            <w:tcW w:type="dxa" w:w="7"/>
             <w:vAlign w:val="center"/>
           </w:tcPr>
           <w:p>
             <w:pPr>
+              <w:spacing w:after="40"/>
               <w:jc w:val="left"/>
             </w:pPr>
-            <w:r/>
+            <w:r>
+              <w:rPr>
+                <w:sz w:val="19"/>
+              </w:rPr>
+            </w:r>
             <w:r>
               <w:rPr>
                 <w:rFonts w:ascii="Arial" w:hAnsi="Arial"/>
@@ -2102,16 +2701,24 @@
         </w:tc>
       </w:tr>
       <w:tr>
+        <w:trPr>
+          <w:cantSplit/>
+        </w:trPr>
         <w:tc>
           <w:tcPr>
-            <w:tcW w:type="dxa" w:w="1728"/>
+            <w:tcW w:type="dxa" w:w="3"/>
             <w:vAlign w:val="center"/>
           </w:tcPr>
           <w:p>
             <w:pPr>
+              <w:spacing w:after="40"/>
               <w:jc w:val="left"/>
             </w:pPr>
-            <w:r/>
+            <w:r>
+              <w:rPr>
+                <w:sz w:val="19"/>
+              </w:rPr>
+            </w:r>
             <w:r>
               <w:rPr>
                 <w:rFonts w:ascii="Arial" w:hAnsi="Arial"/>
@@ -2125,14 +2732,19 @@
         </w:tc>
         <w:tc>
           <w:tcPr>
-            <w:tcW w:type="dxa" w:w="4032"/>
+            <w:tcW w:type="dxa" w:w="4"/>
             <w:vAlign w:val="center"/>
           </w:tcPr>
           <w:p>
             <w:pPr>
+              <w:spacing w:after="40"/>
               <w:jc w:val="left"/>
             </w:pPr>
-            <w:r/>
+            <w:r>
+              <w:rPr>
+                <w:sz w:val="19"/>
+              </w:rPr>
+            </w:r>
             <w:r>
               <w:rPr>
                 <w:rFonts w:ascii="Arial" w:hAnsi="Arial"/>
@@ -2146,14 +2758,19 @@
         </w:tc>
         <w:tc>
           <w:tcPr>
-            <w:tcW w:type="dxa" w:w="5328"/>
+            <w:tcW w:type="dxa" w:w="7"/>
             <w:vAlign w:val="center"/>
           </w:tcPr>
           <w:p>
             <w:pPr>
+              <w:spacing w:after="40"/>
               <w:jc w:val="left"/>
             </w:pPr>
-            <w:r/>
+            <w:r>
+              <w:rPr>
+                <w:sz w:val="19"/>
+              </w:rPr>
+            </w:r>
             <w:r>
               <w:rPr>
                 <w:rFonts w:ascii="Arial" w:hAnsi="Arial"/>
@@ -2167,16 +2784,24 @@
         </w:tc>
       </w:tr>
       <w:tr>
+        <w:trPr>
+          <w:cantSplit/>
+        </w:trPr>
         <w:tc>
           <w:tcPr>
-            <w:tcW w:type="dxa" w:w="1728"/>
+            <w:tcW w:type="dxa" w:w="3"/>
             <w:vAlign w:val="center"/>
           </w:tcPr>
           <w:p>
             <w:pPr>
+              <w:spacing w:after="40"/>
               <w:jc w:val="left"/>
             </w:pPr>
-            <w:r/>
+            <w:r>
+              <w:rPr>
+                <w:sz w:val="19"/>
+              </w:rPr>
+            </w:r>
             <w:r>
               <w:rPr>
                 <w:rFonts w:ascii="Arial" w:hAnsi="Arial"/>
@@ -2190,14 +2815,19 @@
         </w:tc>
         <w:tc>
           <w:tcPr>
-            <w:tcW w:type="dxa" w:w="4032"/>
+            <w:tcW w:type="dxa" w:w="4"/>
             <w:vAlign w:val="center"/>
           </w:tcPr>
           <w:p>
             <w:pPr>
+              <w:spacing w:after="40"/>
               <w:jc w:val="left"/>
             </w:pPr>
-            <w:r/>
+            <w:r>
+              <w:rPr>
+                <w:sz w:val="19"/>
+              </w:rPr>
+            </w:r>
             <w:r>
               <w:rPr>
                 <w:rFonts w:ascii="Arial" w:hAnsi="Arial"/>
@@ -2211,14 +2841,19 @@
         </w:tc>
         <w:tc>
           <w:tcPr>
-            <w:tcW w:type="dxa" w:w="5328"/>
+            <w:tcW w:type="dxa" w:w="7"/>
             <w:vAlign w:val="center"/>
           </w:tcPr>
           <w:p>
             <w:pPr>
+              <w:spacing w:after="40"/>
               <w:jc w:val="left"/>
             </w:pPr>
-            <w:r/>
+            <w:r>
+              <w:rPr>
+                <w:sz w:val="19"/>
+              </w:rPr>
+            </w:r>
             <w:r>
               <w:rPr>
                 <w:rFonts w:ascii="Arial" w:hAnsi="Arial"/>
@@ -2232,32 +2867,56 @@
         </w:tc>
       </w:tr>
       <w:tr>
+        <w:trPr>
+          <w:cantSplit/>
+        </w:trPr>
         <w:tc>
           <w:tcPr>
-            <w:tcW w:type="dxa" w:w="3312"/>
+            <w:tcW w:type="dxa" w:w="3"/>
+            <w:vAlign w:val="center"/>
           </w:tcPr>
           <w:p>
-            <w:r>
+            <w:pPr>
+              <w:spacing w:after="40"/>
+            </w:pPr>
+            <w:r>
+              <w:rPr>
+                <w:sz w:val="19"/>
+              </w:rPr>
               <w:t>IA</w:t>
             </w:r>
           </w:p>
         </w:tc>
         <w:tc>
           <w:tcPr>
-            <w:tcW w:type="dxa" w:w="3312"/>
+            <w:tcW w:type="dxa" w:w="4"/>
+            <w:vAlign w:val="center"/>
           </w:tcPr>
           <w:p>
-            <w:r>
+            <w:pPr>
+              <w:spacing w:after="40"/>
+            </w:pPr>
+            <w:r>
+              <w:rPr>
+                <w:sz w:val="19"/>
+              </w:rPr>
               <w:t>Gemini API</w:t>
             </w:r>
           </w:p>
         </w:tc>
         <w:tc>
           <w:tcPr>
-            <w:tcW w:type="dxa" w:w="3312"/>
+            <w:tcW w:type="dxa" w:w="7"/>
+            <w:vAlign w:val="center"/>
           </w:tcPr>
           <w:p>
-            <w:r>
+            <w:pPr>
+              <w:spacing w:after="40"/>
+            </w:pPr>
+            <w:r>
+              <w:rPr>
+                <w:sz w:val="19"/>
+              </w:rPr>
               <w:t>Génération de descriptions contractuelles détaillées depuis le backend.</w:t>
             </w:r>
           </w:p>
@@ -2338,27 +2997,36 @@
     <w:tbl>
       <w:tblPr>
         <w:tblStyle w:val="TableGrid"/>
-        <w:tblW w:type="auto" w:w="0"/>
-        <w:jc w:val="left"/>
+        <w:tblW w:type="dxa" w:w="9000"/>
+        <w:jc w:val="center"/>
         <w:tblLayout w:type="fixed"/>
         <w:tblLook w:firstColumn="1" w:firstRow="1" w:lastColumn="0" w:lastRow="0" w:noHBand="0" w:noVBand="1" w:val="04A0"/>
       </w:tblPr>
       <w:tblGrid>
-        <w:gridCol w:w="4968"/>
-        <w:gridCol w:w="4968"/>
+        <w:gridCol w:w="3800"/>
+        <w:gridCol w:w="5200"/>
       </w:tblGrid>
       <w:tr>
+        <w:trPr>
+          <w:cantSplit/>
+          <w:tblHeader w:val="true"/>
+        </w:trPr>
         <w:tc>
           <w:tcPr>
-            <w:tcW w:type="dxa" w:w="2736"/>
+            <w:tcW w:type="dxa" w:w="6"/>
             <w:vAlign w:val="center"/>
             <w:shd w:fill="E2E8F0"/>
           </w:tcPr>
           <w:p>
             <w:pPr>
+              <w:spacing w:after="40"/>
               <w:jc w:val="left"/>
             </w:pPr>
-            <w:r/>
+            <w:r>
+              <w:rPr>
+                <w:sz w:val="19"/>
+              </w:rPr>
+            </w:r>
             <w:r>
               <w:rPr>
                 <w:rFonts w:ascii="Arial" w:hAnsi="Arial"/>
@@ -2372,15 +3040,20 @@
         </w:tc>
         <w:tc>
           <w:tcPr>
-            <w:tcW w:type="dxa" w:w="8352"/>
+            <w:tcW w:type="dxa" w:w="8"/>
             <w:vAlign w:val="center"/>
             <w:shd w:fill="E2E8F0"/>
           </w:tcPr>
           <w:p>
             <w:pPr>
+              <w:spacing w:after="40"/>
               <w:jc w:val="left"/>
             </w:pPr>
-            <w:r/>
+            <w:r>
+              <w:rPr>
+                <w:sz w:val="19"/>
+              </w:rPr>
+            </w:r>
             <w:r>
               <w:rPr>
                 <w:rFonts w:ascii="Arial" w:hAnsi="Arial"/>
@@ -2394,16 +3067,24 @@
         </w:tc>
       </w:tr>
       <w:tr>
+        <w:trPr>
+          <w:cantSplit/>
+        </w:trPr>
         <w:tc>
           <w:tcPr>
-            <w:tcW w:type="dxa" w:w="2736"/>
+            <w:tcW w:type="dxa" w:w="6"/>
             <w:vAlign w:val="center"/>
           </w:tcPr>
           <w:p>
             <w:pPr>
+              <w:spacing w:after="40"/>
               <w:jc w:val="left"/>
             </w:pPr>
-            <w:r/>
+            <w:r>
+              <w:rPr>
+                <w:sz w:val="19"/>
+              </w:rPr>
+            </w:r>
             <w:r>
               <w:rPr>
                 <w:rFonts w:ascii="Arial" w:hAnsi="Arial"/>
@@ -2417,14 +3098,19 @@
         </w:tc>
         <w:tc>
           <w:tcPr>
-            <w:tcW w:type="dxa" w:w="8352"/>
+            <w:tcW w:type="dxa" w:w="8"/>
             <w:vAlign w:val="center"/>
           </w:tcPr>
           <w:p>
             <w:pPr>
+              <w:spacing w:after="40"/>
               <w:jc w:val="left"/>
             </w:pPr>
-            <w:r/>
+            <w:r>
+              <w:rPr>
+                <w:sz w:val="19"/>
+              </w:rPr>
+            </w:r>
             <w:r>
               <w:rPr>
                 <w:rFonts w:ascii="Arial" w:hAnsi="Arial"/>
@@ -2438,16 +3124,24 @@
         </w:tc>
       </w:tr>
       <w:tr>
+        <w:trPr>
+          <w:cantSplit/>
+        </w:trPr>
         <w:tc>
           <w:tcPr>
-            <w:tcW w:type="dxa" w:w="2736"/>
+            <w:tcW w:type="dxa" w:w="6"/>
             <w:vAlign w:val="center"/>
           </w:tcPr>
           <w:p>
             <w:pPr>
+              <w:spacing w:after="40"/>
               <w:jc w:val="left"/>
             </w:pPr>
-            <w:r/>
+            <w:r>
+              <w:rPr>
+                <w:sz w:val="19"/>
+              </w:rPr>
+            </w:r>
             <w:r>
               <w:rPr>
                 <w:rFonts w:ascii="Arial" w:hAnsi="Arial"/>
@@ -2461,14 +3155,19 @@
         </w:tc>
         <w:tc>
           <w:tcPr>
-            <w:tcW w:type="dxa" w:w="8352"/>
+            <w:tcW w:type="dxa" w:w="8"/>
             <w:vAlign w:val="center"/>
           </w:tcPr>
           <w:p>
             <w:pPr>
+              <w:spacing w:after="40"/>
               <w:jc w:val="left"/>
             </w:pPr>
-            <w:r/>
+            <w:r>
+              <w:rPr>
+                <w:sz w:val="19"/>
+              </w:rPr>
+            </w:r>
             <w:r>
               <w:rPr>
                 <w:rFonts w:ascii="Arial" w:hAnsi="Arial"/>
@@ -2482,16 +3181,24 @@
         </w:tc>
       </w:tr>
       <w:tr>
+        <w:trPr>
+          <w:cantSplit/>
+        </w:trPr>
         <w:tc>
           <w:tcPr>
-            <w:tcW w:type="dxa" w:w="2736"/>
+            <w:tcW w:type="dxa" w:w="6"/>
             <w:vAlign w:val="center"/>
           </w:tcPr>
           <w:p>
             <w:pPr>
+              <w:spacing w:after="40"/>
               <w:jc w:val="left"/>
             </w:pPr>
-            <w:r/>
+            <w:r>
+              <w:rPr>
+                <w:sz w:val="19"/>
+              </w:rPr>
+            </w:r>
             <w:r>
               <w:rPr>
                 <w:rFonts w:ascii="Arial" w:hAnsi="Arial"/>
@@ -2505,27 +3212,41 @@
         </w:tc>
         <w:tc>
           <w:tcPr>
-            <w:tcW w:type="dxa" w:w="8352"/>
+            <w:tcW w:type="dxa" w:w="8"/>
             <w:vAlign w:val="center"/>
           </w:tcPr>
           <w:p>
-            <w:r>
+            <w:pPr>
+              <w:spacing w:after="40"/>
+            </w:pPr>
+            <w:r>
+              <w:rPr>
+                <w:sz w:val="19"/>
+              </w:rPr>
               <w:t>CRUD contrats, statistiques, échéances, génération PDF/HTML, signature, et génération IA des descriptions contractuelles.</w:t>
             </w:r>
           </w:p>
         </w:tc>
       </w:tr>
       <w:tr>
+        <w:trPr>
+          <w:cantSplit/>
+        </w:trPr>
         <w:tc>
           <w:tcPr>
-            <w:tcW w:type="dxa" w:w="2736"/>
+            <w:tcW w:type="dxa" w:w="6"/>
             <w:vAlign w:val="center"/>
           </w:tcPr>
           <w:p>
             <w:pPr>
+              <w:spacing w:after="40"/>
               <w:jc w:val="left"/>
             </w:pPr>
-            <w:r/>
+            <w:r>
+              <w:rPr>
+                <w:sz w:val="19"/>
+              </w:rPr>
+            </w:r>
             <w:r>
               <w:rPr>
                 <w:rFonts w:ascii="Arial" w:hAnsi="Arial"/>
@@ -2539,14 +3260,19 @@
         </w:tc>
         <w:tc>
           <w:tcPr>
-            <w:tcW w:type="dxa" w:w="8352"/>
+            <w:tcW w:type="dxa" w:w="8"/>
             <w:vAlign w:val="center"/>
           </w:tcPr>
           <w:p>
             <w:pPr>
+              <w:spacing w:after="40"/>
               <w:jc w:val="left"/>
             </w:pPr>
-            <w:r/>
+            <w:r>
+              <w:rPr>
+                <w:sz w:val="19"/>
+              </w:rPr>
+            </w:r>
             <w:r>
               <w:rPr>
                 <w:rFonts w:ascii="Arial" w:hAnsi="Arial"/>
@@ -2560,16 +3286,24 @@
         </w:tc>
       </w:tr>
       <w:tr>
+        <w:trPr>
+          <w:cantSplit/>
+        </w:trPr>
         <w:tc>
           <w:tcPr>
-            <w:tcW w:type="dxa" w:w="2736"/>
+            <w:tcW w:type="dxa" w:w="6"/>
             <w:vAlign w:val="center"/>
           </w:tcPr>
           <w:p>
             <w:pPr>
+              <w:spacing w:after="40"/>
               <w:jc w:val="left"/>
             </w:pPr>
-            <w:r/>
+            <w:r>
+              <w:rPr>
+                <w:sz w:val="19"/>
+              </w:rPr>
+            </w:r>
             <w:r>
               <w:rPr>
                 <w:rFonts w:ascii="Arial" w:hAnsi="Arial"/>
@@ -2583,14 +3317,19 @@
         </w:tc>
         <w:tc>
           <w:tcPr>
-            <w:tcW w:type="dxa" w:w="8352"/>
+            <w:tcW w:type="dxa" w:w="8"/>
             <w:vAlign w:val="center"/>
           </w:tcPr>
           <w:p>
             <w:pPr>
+              <w:spacing w:after="40"/>
               <w:jc w:val="left"/>
             </w:pPr>
-            <w:r/>
+            <w:r>
+              <w:rPr>
+                <w:sz w:val="19"/>
+              </w:rPr>
+            </w:r>
             <w:r>
               <w:rPr>
                 <w:rFonts w:ascii="Arial" w:hAnsi="Arial"/>
@@ -2616,27 +3355,36 @@
     <w:tbl>
       <w:tblPr>
         <w:tblStyle w:val="TableGrid"/>
-        <w:tblW w:type="auto" w:w="0"/>
-        <w:jc w:val="left"/>
+        <w:tblW w:type="dxa" w:w="9000"/>
+        <w:jc w:val="center"/>
         <w:tblLayout w:type="fixed"/>
         <w:tblLook w:firstColumn="1" w:firstRow="1" w:lastColumn="0" w:lastRow="0" w:noHBand="0" w:noVBand="1" w:val="04A0"/>
       </w:tblPr>
       <w:tblGrid>
-        <w:gridCol w:w="4968"/>
-        <w:gridCol w:w="4968"/>
+        <w:gridCol w:w="3800"/>
+        <w:gridCol w:w="5200"/>
       </w:tblGrid>
       <w:tr>
+        <w:trPr>
+          <w:cantSplit/>
+          <w:tblHeader w:val="true"/>
+        </w:trPr>
         <w:tc>
           <w:tcPr>
-            <w:tcW w:type="dxa" w:w="2736"/>
+            <w:tcW w:type="dxa" w:w="6"/>
             <w:vAlign w:val="center"/>
             <w:shd w:fill="E2E8F0"/>
           </w:tcPr>
           <w:p>
             <w:pPr>
+              <w:spacing w:after="40"/>
               <w:jc w:val="left"/>
             </w:pPr>
-            <w:r/>
+            <w:r>
+              <w:rPr>
+                <w:sz w:val="19"/>
+              </w:rPr>
+            </w:r>
             <w:r>
               <w:rPr>
                 <w:rFonts w:ascii="Arial" w:hAnsi="Arial"/>
@@ -2650,15 +3398,20 @@
         </w:tc>
         <w:tc>
           <w:tcPr>
-            <w:tcW w:type="dxa" w:w="8352"/>
+            <w:tcW w:type="dxa" w:w="8"/>
             <w:vAlign w:val="center"/>
             <w:shd w:fill="E2E8F0"/>
           </w:tcPr>
           <w:p>
             <w:pPr>
+              <w:spacing w:after="40"/>
               <w:jc w:val="left"/>
             </w:pPr>
-            <w:r/>
+            <w:r>
+              <w:rPr>
+                <w:sz w:val="19"/>
+              </w:rPr>
+            </w:r>
             <w:r>
               <w:rPr>
                 <w:rFonts w:ascii="Arial" w:hAnsi="Arial"/>
@@ -2672,16 +3425,24 @@
         </w:tc>
       </w:tr>
       <w:tr>
+        <w:trPr>
+          <w:cantSplit/>
+        </w:trPr>
         <w:tc>
           <w:tcPr>
-            <w:tcW w:type="dxa" w:w="2736"/>
+            <w:tcW w:type="dxa" w:w="6"/>
             <w:vAlign w:val="center"/>
           </w:tcPr>
           <w:p>
             <w:pPr>
+              <w:spacing w:after="40"/>
               <w:jc w:val="left"/>
             </w:pPr>
-            <w:r/>
+            <w:r>
+              <w:rPr>
+                <w:sz w:val="19"/>
+              </w:rPr>
+            </w:r>
             <w:r>
               <w:rPr>
                 <w:rFonts w:ascii="Arial" w:hAnsi="Arial"/>
@@ -2695,14 +3456,19 @@
         </w:tc>
         <w:tc>
           <w:tcPr>
-            <w:tcW w:type="dxa" w:w="8352"/>
+            <w:tcW w:type="dxa" w:w="8"/>
             <w:vAlign w:val="center"/>
           </w:tcPr>
           <w:p>
             <w:pPr>
+              <w:spacing w:after="40"/>
               <w:jc w:val="left"/>
             </w:pPr>
-            <w:r/>
+            <w:r>
+              <w:rPr>
+                <w:sz w:val="19"/>
+              </w:rPr>
+            </w:r>
             <w:r>
               <w:rPr>
                 <w:rFonts w:ascii="Arial" w:hAnsi="Arial"/>
@@ -2716,16 +3482,24 @@
         </w:tc>
       </w:tr>
       <w:tr>
+        <w:trPr>
+          <w:cantSplit/>
+        </w:trPr>
         <w:tc>
           <w:tcPr>
-            <w:tcW w:type="dxa" w:w="2736"/>
+            <w:tcW w:type="dxa" w:w="6"/>
             <w:vAlign w:val="center"/>
           </w:tcPr>
           <w:p>
             <w:pPr>
+              <w:spacing w:after="40"/>
               <w:jc w:val="left"/>
             </w:pPr>
-            <w:r/>
+            <w:r>
+              <w:rPr>
+                <w:sz w:val="19"/>
+              </w:rPr>
+            </w:r>
             <w:r>
               <w:rPr>
                 <w:rFonts w:ascii="Arial" w:hAnsi="Arial"/>
@@ -2739,14 +3513,19 @@
         </w:tc>
         <w:tc>
           <w:tcPr>
-            <w:tcW w:type="dxa" w:w="8352"/>
+            <w:tcW w:type="dxa" w:w="8"/>
             <w:vAlign w:val="center"/>
           </w:tcPr>
           <w:p>
             <w:pPr>
+              <w:spacing w:after="40"/>
               <w:jc w:val="left"/>
             </w:pPr>
-            <w:r/>
+            <w:r>
+              <w:rPr>
+                <w:sz w:val="19"/>
+              </w:rPr>
+            </w:r>
             <w:r>
               <w:rPr>
                 <w:rFonts w:ascii="Arial" w:hAnsi="Arial"/>
@@ -2760,16 +3539,24 @@
         </w:tc>
       </w:tr>
       <w:tr>
+        <w:trPr>
+          <w:cantSplit/>
+        </w:trPr>
         <w:tc>
           <w:tcPr>
-            <w:tcW w:type="dxa" w:w="2736"/>
+            <w:tcW w:type="dxa" w:w="6"/>
             <w:vAlign w:val="center"/>
           </w:tcPr>
           <w:p>
             <w:pPr>
+              <w:spacing w:after="40"/>
               <w:jc w:val="left"/>
             </w:pPr>
-            <w:r/>
+            <w:r>
+              <w:rPr>
+                <w:sz w:val="19"/>
+              </w:rPr>
+            </w:r>
             <w:r>
               <w:rPr>
                 <w:rFonts w:ascii="Arial" w:hAnsi="Arial"/>
@@ -2783,27 +3570,41 @@
         </w:tc>
         <w:tc>
           <w:tcPr>
-            <w:tcW w:type="dxa" w:w="8352"/>
+            <w:tcW w:type="dxa" w:w="8"/>
             <w:vAlign w:val="center"/>
           </w:tcPr>
           <w:p>
-            <w:r>
+            <w:pPr>
+              <w:spacing w:after="40"/>
+            </w:pPr>
+            <w:r>
+              <w:rPr>
+                <w:sz w:val="19"/>
+              </w:rPr>
               <w:t>Liste, création, modification, détail, signature, génération IA de description et export PDF multi-pages.</w:t>
             </w:r>
           </w:p>
         </w:tc>
       </w:tr>
       <w:tr>
+        <w:trPr>
+          <w:cantSplit/>
+        </w:trPr>
         <w:tc>
           <w:tcPr>
-            <w:tcW w:type="dxa" w:w="2736"/>
+            <w:tcW w:type="dxa" w:w="6"/>
             <w:vAlign w:val="center"/>
           </w:tcPr>
           <w:p>
             <w:pPr>
+              <w:spacing w:after="40"/>
               <w:jc w:val="left"/>
             </w:pPr>
-            <w:r/>
+            <w:r>
+              <w:rPr>
+                <w:sz w:val="19"/>
+              </w:rPr>
+            </w:r>
             <w:r>
               <w:rPr>
                 <w:rFonts w:ascii="Arial" w:hAnsi="Arial"/>
@@ -2817,14 +3618,19 @@
         </w:tc>
         <w:tc>
           <w:tcPr>
-            <w:tcW w:type="dxa" w:w="8352"/>
+            <w:tcW w:type="dxa" w:w="8"/>
             <w:vAlign w:val="center"/>
           </w:tcPr>
           <w:p>
             <w:pPr>
+              <w:spacing w:after="40"/>
               <w:jc w:val="left"/>
             </w:pPr>
-            <w:r/>
+            <w:r>
+              <w:rPr>
+                <w:sz w:val="19"/>
+              </w:rPr>
+            </w:r>
             <w:r>
               <w:rPr>
                 <w:rFonts w:ascii="Arial" w:hAnsi="Arial"/>
@@ -2838,16 +3644,24 @@
         </w:tc>
       </w:tr>
       <w:tr>
+        <w:trPr>
+          <w:cantSplit/>
+        </w:trPr>
         <w:tc>
           <w:tcPr>
-            <w:tcW w:type="dxa" w:w="2736"/>
+            <w:tcW w:type="dxa" w:w="6"/>
             <w:vAlign w:val="center"/>
           </w:tcPr>
           <w:p>
             <w:pPr>
+              <w:spacing w:after="40"/>
               <w:jc w:val="left"/>
             </w:pPr>
-            <w:r/>
+            <w:r>
+              <w:rPr>
+                <w:sz w:val="19"/>
+              </w:rPr>
+            </w:r>
             <w:r>
               <w:rPr>
                 <w:rFonts w:ascii="Arial" w:hAnsi="Arial"/>
@@ -2861,14 +3675,19 @@
         </w:tc>
         <w:tc>
           <w:tcPr>
-            <w:tcW w:type="dxa" w:w="8352"/>
+            <w:tcW w:type="dxa" w:w="8"/>
             <w:vAlign w:val="center"/>
           </w:tcPr>
           <w:p>
             <w:pPr>
+              <w:spacing w:after="40"/>
               <w:jc w:val="left"/>
             </w:pPr>
-            <w:r/>
+            <w:r>
+              <w:rPr>
+                <w:sz w:val="19"/>
+              </w:rPr>
+            </w:r>
             <w:r>
               <w:rPr>
                 <w:rFonts w:ascii="Arial" w:hAnsi="Arial"/>
@@ -2894,28 +3713,37 @@
     <w:tbl>
       <w:tblPr>
         <w:tblStyle w:val="TableGrid"/>
-        <w:tblW w:type="auto" w:w="0"/>
-        <w:jc w:val="left"/>
+        <w:tblW w:type="dxa" w:w="9000"/>
+        <w:jc w:val="center"/>
         <w:tblLayout w:type="fixed"/>
         <w:tblLook w:firstColumn="1" w:firstRow="1" w:lastColumn="0" w:lastRow="0" w:noHBand="0" w:noVBand="1" w:val="04A0"/>
       </w:tblPr>
       <w:tblGrid>
-        <w:gridCol w:w="3312"/>
-        <w:gridCol w:w="3312"/>
-        <w:gridCol w:w="3312"/>
+        <w:gridCol w:w="1250"/>
+        <w:gridCol w:w="2400"/>
+        <w:gridCol w:w="5350"/>
       </w:tblGrid>
       <w:tr>
+        <w:trPr>
+          <w:cantSplit/>
+          <w:tblHeader w:val="true"/>
+        </w:trPr>
         <w:tc>
           <w:tcPr>
-            <w:tcW w:type="dxa" w:w="2448"/>
+            <w:tcW w:type="dxa" w:w="2"/>
             <w:vAlign w:val="center"/>
             <w:shd w:fill="E2E8F0"/>
           </w:tcPr>
           <w:p>
             <w:pPr>
+              <w:spacing w:after="40"/>
               <w:jc w:val="left"/>
             </w:pPr>
-            <w:r/>
+            <w:r>
+              <w:rPr>
+                <w:sz w:val="19"/>
+              </w:rPr>
+            </w:r>
             <w:r>
               <w:rPr>
                 <w:rFonts w:ascii="Arial" w:hAnsi="Arial"/>
@@ -2929,15 +3757,20 @@
         </w:tc>
         <w:tc>
           <w:tcPr>
-            <w:tcW w:type="dxa" w:w="3168"/>
+            <w:tcW w:type="dxa" w:w="4"/>
             <w:vAlign w:val="center"/>
             <w:shd w:fill="E2E8F0"/>
           </w:tcPr>
           <w:p>
             <w:pPr>
+              <w:spacing w:after="40"/>
               <w:jc w:val="left"/>
             </w:pPr>
-            <w:r/>
+            <w:r>
+              <w:rPr>
+                <w:sz w:val="19"/>
+              </w:rPr>
+            </w:r>
             <w:r>
               <w:rPr>
                 <w:rFonts w:ascii="Arial" w:hAnsi="Arial"/>
@@ -2951,15 +3784,20 @@
         </w:tc>
         <w:tc>
           <w:tcPr>
-            <w:tcW w:type="dxa" w:w="5472"/>
+            <w:tcW w:type="dxa" w:w="8"/>
             <w:vAlign w:val="center"/>
             <w:shd w:fill="E2E8F0"/>
           </w:tcPr>
           <w:p>
             <w:pPr>
+              <w:spacing w:after="40"/>
               <w:jc w:val="left"/>
             </w:pPr>
-            <w:r/>
+            <w:r>
+              <w:rPr>
+                <w:sz w:val="19"/>
+              </w:rPr>
+            </w:r>
             <w:r>
               <w:rPr>
                 <w:rFonts w:ascii="Arial" w:hAnsi="Arial"/>
@@ -2973,16 +3811,24 @@
         </w:tc>
       </w:tr>
       <w:tr>
+        <w:trPr>
+          <w:cantSplit/>
+        </w:trPr>
         <w:tc>
           <w:tcPr>
-            <w:tcW w:type="dxa" w:w="2448"/>
+            <w:tcW w:type="dxa" w:w="2"/>
             <w:vAlign w:val="center"/>
           </w:tcPr>
           <w:p>
             <w:pPr>
+              <w:spacing w:after="40"/>
               <w:jc w:val="left"/>
             </w:pPr>
-            <w:r/>
+            <w:r>
+              <w:rPr>
+                <w:sz w:val="19"/>
+              </w:rPr>
+            </w:r>
             <w:r>
               <w:rPr>
                 <w:rFonts w:ascii="Arial" w:hAnsi="Arial"/>
@@ -2996,14 +3842,19 @@
         </w:tc>
         <w:tc>
           <w:tcPr>
-            <w:tcW w:type="dxa" w:w="3168"/>
+            <w:tcW w:type="dxa" w:w="4"/>
             <w:vAlign w:val="center"/>
           </w:tcPr>
           <w:p>
             <w:pPr>
+              <w:spacing w:after="40"/>
               <w:jc w:val="left"/>
             </w:pPr>
-            <w:r/>
+            <w:r>
+              <w:rPr>
+                <w:sz w:val="19"/>
+              </w:rPr>
+            </w:r>
             <w:r>
               <w:rPr>
                 <w:rFonts w:ascii="Arial" w:hAnsi="Arial"/>
@@ -3017,14 +3868,19 @@
         </w:tc>
         <w:tc>
           <w:tcPr>
-            <w:tcW w:type="dxa" w:w="5472"/>
+            <w:tcW w:type="dxa" w:w="8"/>
             <w:vAlign w:val="center"/>
           </w:tcPr>
           <w:p>
             <w:pPr>
+              <w:spacing w:after="40"/>
               <w:jc w:val="left"/>
             </w:pPr>
-            <w:r/>
+            <w:r>
+              <w:rPr>
+                <w:sz w:val="19"/>
+              </w:rPr>
+            </w:r>
             <w:r>
               <w:rPr>
                 <w:rFonts w:ascii="Arial" w:hAnsi="Arial"/>
@@ -3038,16 +3894,24 @@
         </w:tc>
       </w:tr>
       <w:tr>
+        <w:trPr>
+          <w:cantSplit/>
+        </w:trPr>
         <w:tc>
           <w:tcPr>
-            <w:tcW w:type="dxa" w:w="2448"/>
+            <w:tcW w:type="dxa" w:w="2"/>
             <w:vAlign w:val="center"/>
           </w:tcPr>
           <w:p>
             <w:pPr>
+              <w:spacing w:after="40"/>
               <w:jc w:val="left"/>
             </w:pPr>
-            <w:r/>
+            <w:r>
+              <w:rPr>
+                <w:sz w:val="19"/>
+              </w:rPr>
+            </w:r>
             <w:r>
               <w:rPr>
                 <w:rFonts w:ascii="Arial" w:hAnsi="Arial"/>
@@ -3061,14 +3925,19 @@
         </w:tc>
         <w:tc>
           <w:tcPr>
-            <w:tcW w:type="dxa" w:w="3168"/>
+            <w:tcW w:type="dxa" w:w="4"/>
             <w:vAlign w:val="center"/>
           </w:tcPr>
           <w:p>
             <w:pPr>
+              <w:spacing w:after="40"/>
               <w:jc w:val="left"/>
             </w:pPr>
-            <w:r/>
+            <w:r>
+              <w:rPr>
+                <w:sz w:val="19"/>
+              </w:rPr>
+            </w:r>
             <w:r>
               <w:rPr>
                 <w:rFonts w:ascii="Arial" w:hAnsi="Arial"/>
@@ -3082,14 +3951,19 @@
         </w:tc>
         <w:tc>
           <w:tcPr>
-            <w:tcW w:type="dxa" w:w="5472"/>
+            <w:tcW w:type="dxa" w:w="8"/>
             <w:vAlign w:val="center"/>
           </w:tcPr>
           <w:p>
             <w:pPr>
+              <w:spacing w:after="40"/>
               <w:jc w:val="left"/>
             </w:pPr>
-            <w:r/>
+            <w:r>
+              <w:rPr>
+                <w:sz w:val="19"/>
+              </w:rPr>
+            </w:r>
             <w:r>
               <w:rPr>
                 <w:rFonts w:ascii="Arial" w:hAnsi="Arial"/>
@@ -3103,16 +3977,24 @@
         </w:tc>
       </w:tr>
       <w:tr>
+        <w:trPr>
+          <w:cantSplit/>
+        </w:trPr>
         <w:tc>
           <w:tcPr>
-            <w:tcW w:type="dxa" w:w="2448"/>
+            <w:tcW w:type="dxa" w:w="2"/>
             <w:vAlign w:val="center"/>
           </w:tcPr>
           <w:p>
             <w:pPr>
+              <w:spacing w:after="40"/>
               <w:jc w:val="left"/>
             </w:pPr>
-            <w:r/>
+            <w:r>
+              <w:rPr>
+                <w:sz w:val="19"/>
+              </w:rPr>
+            </w:r>
             <w:r>
               <w:rPr>
                 <w:rFonts w:ascii="Arial" w:hAnsi="Arial"/>
@@ -3126,14 +4008,19 @@
         </w:tc>
         <w:tc>
           <w:tcPr>
-            <w:tcW w:type="dxa" w:w="3168"/>
+            <w:tcW w:type="dxa" w:w="4"/>
             <w:vAlign w:val="center"/>
           </w:tcPr>
           <w:p>
             <w:pPr>
+              <w:spacing w:after="40"/>
               <w:jc w:val="left"/>
             </w:pPr>
-            <w:r/>
+            <w:r>
+              <w:rPr>
+                <w:sz w:val="19"/>
+              </w:rPr>
+            </w:r>
             <w:r>
               <w:rPr>
                 <w:rFonts w:ascii="Arial" w:hAnsi="Arial"/>
@@ -3147,14 +4034,19 @@
         </w:tc>
         <w:tc>
           <w:tcPr>
-            <w:tcW w:type="dxa" w:w="5472"/>
+            <w:tcW w:type="dxa" w:w="8"/>
             <w:vAlign w:val="center"/>
           </w:tcPr>
           <w:p>
             <w:pPr>
+              <w:spacing w:after="40"/>
               <w:jc w:val="left"/>
             </w:pPr>
-            <w:r/>
+            <w:r>
+              <w:rPr>
+                <w:sz w:val="19"/>
+              </w:rPr>
+            </w:r>
             <w:r>
               <w:rPr>
                 <w:rFonts w:ascii="Arial" w:hAnsi="Arial"/>
@@ -3168,16 +4060,24 @@
         </w:tc>
       </w:tr>
       <w:tr>
+        <w:trPr>
+          <w:cantSplit/>
+        </w:trPr>
         <w:tc>
           <w:tcPr>
-            <w:tcW w:type="dxa" w:w="2448"/>
+            <w:tcW w:type="dxa" w:w="2"/>
             <w:vAlign w:val="center"/>
           </w:tcPr>
           <w:p>
             <w:pPr>
+              <w:spacing w:after="40"/>
               <w:jc w:val="left"/>
             </w:pPr>
-            <w:r/>
+            <w:r>
+              <w:rPr>
+                <w:sz w:val="19"/>
+              </w:rPr>
+            </w:r>
             <w:r>
               <w:rPr>
                 <w:rFonts w:ascii="Arial" w:hAnsi="Arial"/>
@@ -3191,14 +4091,19 @@
         </w:tc>
         <w:tc>
           <w:tcPr>
-            <w:tcW w:type="dxa" w:w="3168"/>
+            <w:tcW w:type="dxa" w:w="4"/>
             <w:vAlign w:val="center"/>
           </w:tcPr>
           <w:p>
             <w:pPr>
+              <w:spacing w:after="40"/>
               <w:jc w:val="left"/>
             </w:pPr>
-            <w:r/>
+            <w:r>
+              <w:rPr>
+                <w:sz w:val="19"/>
+              </w:rPr>
+            </w:r>
             <w:r>
               <w:rPr>
                 <w:rFonts w:ascii="Arial" w:hAnsi="Arial"/>
@@ -3212,14 +4117,19 @@
         </w:tc>
         <w:tc>
           <w:tcPr>
-            <w:tcW w:type="dxa" w:w="5472"/>
+            <w:tcW w:type="dxa" w:w="8"/>
             <w:vAlign w:val="center"/>
           </w:tcPr>
           <w:p>
             <w:pPr>
+              <w:spacing w:after="40"/>
               <w:jc w:val="left"/>
             </w:pPr>
-            <w:r/>
+            <w:r>
+              <w:rPr>
+                <w:sz w:val="19"/>
+              </w:rPr>
+            </w:r>
             <w:r>
               <w:rPr>
                 <w:rFonts w:ascii="Arial" w:hAnsi="Arial"/>
@@ -3233,16 +4143,24 @@
         </w:tc>
       </w:tr>
       <w:tr>
+        <w:trPr>
+          <w:cantSplit/>
+        </w:trPr>
         <w:tc>
           <w:tcPr>
-            <w:tcW w:type="dxa" w:w="2448"/>
+            <w:tcW w:type="dxa" w:w="2"/>
             <w:vAlign w:val="center"/>
           </w:tcPr>
           <w:p>
             <w:pPr>
+              <w:spacing w:after="40"/>
               <w:jc w:val="left"/>
             </w:pPr>
-            <w:r/>
+            <w:r>
+              <w:rPr>
+                <w:sz w:val="19"/>
+              </w:rPr>
+            </w:r>
             <w:r>
               <w:rPr>
                 <w:rFonts w:ascii="Arial" w:hAnsi="Arial"/>
@@ -3256,14 +4174,19 @@
         </w:tc>
         <w:tc>
           <w:tcPr>
-            <w:tcW w:type="dxa" w:w="3168"/>
+            <w:tcW w:type="dxa" w:w="4"/>
             <w:vAlign w:val="center"/>
           </w:tcPr>
           <w:p>
             <w:pPr>
+              <w:spacing w:after="40"/>
               <w:jc w:val="left"/>
             </w:pPr>
-            <w:r/>
+            <w:r>
+              <w:rPr>
+                <w:sz w:val="19"/>
+              </w:rPr>
+            </w:r>
             <w:r>
               <w:rPr>
                 <w:rFonts w:ascii="Arial" w:hAnsi="Arial"/>
@@ -3277,14 +4200,19 @@
         </w:tc>
         <w:tc>
           <w:tcPr>
-            <w:tcW w:type="dxa" w:w="5472"/>
+            <w:tcW w:type="dxa" w:w="8"/>
             <w:vAlign w:val="center"/>
           </w:tcPr>
           <w:p>
             <w:pPr>
+              <w:spacing w:after="40"/>
               <w:jc w:val="left"/>
             </w:pPr>
-            <w:r/>
+            <w:r>
+              <w:rPr>
+                <w:sz w:val="19"/>
+              </w:rPr>
+            </w:r>
             <w:r>
               <w:rPr>
                 <w:rFonts w:ascii="Arial" w:hAnsi="Arial"/>
@@ -3298,16 +4226,24 @@
         </w:tc>
       </w:tr>
       <w:tr>
+        <w:trPr>
+          <w:cantSplit/>
+        </w:trPr>
         <w:tc>
           <w:tcPr>
-            <w:tcW w:type="dxa" w:w="2448"/>
+            <w:tcW w:type="dxa" w:w="2"/>
             <w:vAlign w:val="center"/>
           </w:tcPr>
           <w:p>
             <w:pPr>
+              <w:spacing w:after="40"/>
               <w:jc w:val="left"/>
             </w:pPr>
-            <w:r/>
+            <w:r>
+              <w:rPr>
+                <w:sz w:val="19"/>
+              </w:rPr>
+            </w:r>
             <w:r>
               <w:rPr>
                 <w:rFonts w:ascii="Arial" w:hAnsi="Arial"/>
@@ -3321,14 +4257,19 @@
         </w:tc>
         <w:tc>
           <w:tcPr>
-            <w:tcW w:type="dxa" w:w="3168"/>
+            <w:tcW w:type="dxa" w:w="4"/>
             <w:vAlign w:val="center"/>
           </w:tcPr>
           <w:p>
             <w:pPr>
+              <w:spacing w:after="40"/>
               <w:jc w:val="left"/>
             </w:pPr>
-            <w:r/>
+            <w:r>
+              <w:rPr>
+                <w:sz w:val="19"/>
+              </w:rPr>
+            </w:r>
             <w:r>
               <w:rPr>
                 <w:rFonts w:ascii="Arial" w:hAnsi="Arial"/>
@@ -3342,14 +4283,19 @@
         </w:tc>
         <w:tc>
           <w:tcPr>
-            <w:tcW w:type="dxa" w:w="5472"/>
+            <w:tcW w:type="dxa" w:w="8"/>
             <w:vAlign w:val="center"/>
           </w:tcPr>
           <w:p>
             <w:pPr>
+              <w:spacing w:after="40"/>
               <w:jc w:val="left"/>
             </w:pPr>
-            <w:r/>
+            <w:r>
+              <w:rPr>
+                <w:sz w:val="19"/>
+              </w:rPr>
+            </w:r>
             <w:r>
               <w:rPr>
                 <w:rFonts w:ascii="Arial" w:hAnsi="Arial"/>
@@ -3363,16 +4309,24 @@
         </w:tc>
       </w:tr>
       <w:tr>
+        <w:trPr>
+          <w:cantSplit/>
+        </w:trPr>
         <w:tc>
           <w:tcPr>
-            <w:tcW w:type="dxa" w:w="2448"/>
+            <w:tcW w:type="dxa" w:w="2"/>
             <w:vAlign w:val="center"/>
           </w:tcPr>
           <w:p>
             <w:pPr>
+              <w:spacing w:after="40"/>
               <w:jc w:val="left"/>
             </w:pPr>
-            <w:r/>
+            <w:r>
+              <w:rPr>
+                <w:sz w:val="19"/>
+              </w:rPr>
+            </w:r>
             <w:r>
               <w:rPr>
                 <w:rFonts w:ascii="Arial" w:hAnsi="Arial"/>
@@ -3386,14 +4340,19 @@
         </w:tc>
         <w:tc>
           <w:tcPr>
-            <w:tcW w:type="dxa" w:w="3168"/>
+            <w:tcW w:type="dxa" w:w="4"/>
             <w:vAlign w:val="center"/>
           </w:tcPr>
           <w:p>
             <w:pPr>
+              <w:spacing w:after="40"/>
               <w:jc w:val="left"/>
             </w:pPr>
-            <w:r/>
+            <w:r>
+              <w:rPr>
+                <w:sz w:val="19"/>
+              </w:rPr>
+            </w:r>
             <w:r>
               <w:rPr>
                 <w:rFonts w:ascii="Arial" w:hAnsi="Arial"/>
@@ -3407,14 +4366,19 @@
         </w:tc>
         <w:tc>
           <w:tcPr>
-            <w:tcW w:type="dxa" w:w="5472"/>
+            <w:tcW w:type="dxa" w:w="8"/>
             <w:vAlign w:val="center"/>
           </w:tcPr>
           <w:p>
             <w:pPr>
+              <w:spacing w:after="40"/>
               <w:jc w:val="left"/>
             </w:pPr>
-            <w:r/>
+            <w:r>
+              <w:rPr>
+                <w:sz w:val="19"/>
+              </w:rPr>
+            </w:r>
             <w:r>
               <w:rPr>
                 <w:rFonts w:ascii="Arial" w:hAnsi="Arial"/>
@@ -3428,16 +4392,24 @@
         </w:tc>
       </w:tr>
       <w:tr>
+        <w:trPr>
+          <w:cantSplit/>
+        </w:trPr>
         <w:tc>
           <w:tcPr>
-            <w:tcW w:type="dxa" w:w="2448"/>
+            <w:tcW w:type="dxa" w:w="2"/>
             <w:vAlign w:val="center"/>
           </w:tcPr>
           <w:p>
             <w:pPr>
+              <w:spacing w:after="40"/>
               <w:jc w:val="left"/>
             </w:pPr>
-            <w:r/>
+            <w:r>
+              <w:rPr>
+                <w:sz w:val="19"/>
+              </w:rPr>
+            </w:r>
             <w:r>
               <w:rPr>
                 <w:rFonts w:ascii="Arial" w:hAnsi="Arial"/>
@@ -3451,14 +4423,19 @@
         </w:tc>
         <w:tc>
           <w:tcPr>
-            <w:tcW w:type="dxa" w:w="3168"/>
+            <w:tcW w:type="dxa" w:w="4"/>
             <w:vAlign w:val="center"/>
           </w:tcPr>
           <w:p>
             <w:pPr>
+              <w:spacing w:after="40"/>
               <w:jc w:val="left"/>
             </w:pPr>
-            <w:r/>
+            <w:r>
+              <w:rPr>
+                <w:sz w:val="19"/>
+              </w:rPr>
+            </w:r>
             <w:r>
               <w:rPr>
                 <w:rFonts w:ascii="Arial" w:hAnsi="Arial"/>
@@ -3472,14 +4449,19 @@
         </w:tc>
         <w:tc>
           <w:tcPr>
-            <w:tcW w:type="dxa" w:w="5472"/>
+            <w:tcW w:type="dxa" w:w="8"/>
             <w:vAlign w:val="center"/>
           </w:tcPr>
           <w:p>
             <w:pPr>
+              <w:spacing w:after="40"/>
               <w:jc w:val="left"/>
             </w:pPr>
-            <w:r/>
+            <w:r>
+              <w:rPr>
+                <w:sz w:val="19"/>
+              </w:rPr>
+            </w:r>
             <w:r>
               <w:rPr>
                 <w:rFonts w:ascii="Arial" w:hAnsi="Arial"/>
@@ -3493,16 +4475,24 @@
         </w:tc>
       </w:tr>
       <w:tr>
+        <w:trPr>
+          <w:cantSplit/>
+        </w:trPr>
         <w:tc>
           <w:tcPr>
-            <w:tcW w:type="dxa" w:w="2448"/>
+            <w:tcW w:type="dxa" w:w="2"/>
             <w:vAlign w:val="center"/>
           </w:tcPr>
           <w:p>
             <w:pPr>
+              <w:spacing w:after="40"/>
               <w:jc w:val="left"/>
             </w:pPr>
-            <w:r/>
+            <w:r>
+              <w:rPr>
+                <w:sz w:val="19"/>
+              </w:rPr>
+            </w:r>
             <w:r>
               <w:rPr>
                 <w:rFonts w:ascii="Arial" w:hAnsi="Arial"/>
@@ -3516,14 +4506,19 @@
         </w:tc>
         <w:tc>
           <w:tcPr>
-            <w:tcW w:type="dxa" w:w="3168"/>
+            <w:tcW w:type="dxa" w:w="4"/>
             <w:vAlign w:val="center"/>
           </w:tcPr>
           <w:p>
             <w:pPr>
+              <w:spacing w:after="40"/>
               <w:jc w:val="left"/>
             </w:pPr>
-            <w:r/>
+            <w:r>
+              <w:rPr>
+                <w:sz w:val="19"/>
+              </w:rPr>
+            </w:r>
             <w:r>
               <w:rPr>
                 <w:rFonts w:ascii="Arial" w:hAnsi="Arial"/>
@@ -3537,14 +4532,19 @@
         </w:tc>
         <w:tc>
           <w:tcPr>
-            <w:tcW w:type="dxa" w:w="5472"/>
+            <w:tcW w:type="dxa" w:w="8"/>
             <w:vAlign w:val="center"/>
           </w:tcPr>
           <w:p>
             <w:pPr>
+              <w:spacing w:after="40"/>
               <w:jc w:val="left"/>
             </w:pPr>
-            <w:r/>
+            <w:r>
+              <w:rPr>
+                <w:sz w:val="19"/>
+              </w:rPr>
+            </w:r>
             <w:r>
               <w:rPr>
                 <w:rFonts w:ascii="Arial" w:hAnsi="Arial"/>
@@ -3570,28 +4570,37 @@
     <w:tbl>
       <w:tblPr>
         <w:tblStyle w:val="TableGrid"/>
-        <w:tblW w:type="auto" w:w="0"/>
-        <w:jc w:val="left"/>
+        <w:tblW w:type="dxa" w:w="9000"/>
+        <w:jc w:val="center"/>
         <w:tblLayout w:type="fixed"/>
         <w:tblLook w:firstColumn="1" w:firstRow="1" w:lastColumn="0" w:lastRow="0" w:noHBand="0" w:noVBand="1" w:val="04A0"/>
       </w:tblPr>
       <w:tblGrid>
-        <w:gridCol w:w="3312"/>
-        <w:gridCol w:w="3312"/>
-        <w:gridCol w:w="3312"/>
+        <w:gridCol w:w="1250"/>
+        <w:gridCol w:w="2400"/>
+        <w:gridCol w:w="5350"/>
       </w:tblGrid>
       <w:tr>
+        <w:trPr>
+          <w:cantSplit/>
+          <w:tblHeader w:val="true"/>
+        </w:trPr>
         <w:tc>
           <w:tcPr>
-            <w:tcW w:type="dxa" w:w="2160"/>
+            <w:tcW w:type="dxa" w:w="2"/>
             <w:vAlign w:val="center"/>
             <w:shd w:fill="E2E8F0"/>
           </w:tcPr>
           <w:p>
             <w:pPr>
+              <w:spacing w:after="40"/>
               <w:jc w:val="left"/>
             </w:pPr>
-            <w:r/>
+            <w:r>
+              <w:rPr>
+                <w:sz w:val="19"/>
+              </w:rPr>
+            </w:r>
             <w:r>
               <w:rPr>
                 <w:rFonts w:ascii="Arial" w:hAnsi="Arial"/>
@@ -3605,15 +4614,20 @@
         </w:tc>
         <w:tc>
           <w:tcPr>
-            <w:tcW w:type="dxa" w:w="4896"/>
+            <w:tcW w:type="dxa" w:w="4"/>
             <w:vAlign w:val="center"/>
             <w:shd w:fill="E2E8F0"/>
           </w:tcPr>
           <w:p>
             <w:pPr>
+              <w:spacing w:after="40"/>
               <w:jc w:val="left"/>
             </w:pPr>
-            <w:r/>
+            <w:r>
+              <w:rPr>
+                <w:sz w:val="19"/>
+              </w:rPr>
+            </w:r>
             <w:r>
               <w:rPr>
                 <w:rFonts w:ascii="Arial" w:hAnsi="Arial"/>
@@ -3627,15 +4641,20 @@
         </w:tc>
         <w:tc>
           <w:tcPr>
-            <w:tcW w:type="dxa" w:w="4032"/>
+            <w:tcW w:type="dxa" w:w="8"/>
             <w:vAlign w:val="center"/>
             <w:shd w:fill="E2E8F0"/>
           </w:tcPr>
           <w:p>
             <w:pPr>
+              <w:spacing w:after="40"/>
               <w:jc w:val="left"/>
             </w:pPr>
-            <w:r/>
+            <w:r>
+              <w:rPr>
+                <w:sz w:val="19"/>
+              </w:rPr>
+            </w:r>
             <w:r>
               <w:rPr>
                 <w:rFonts w:ascii="Arial" w:hAnsi="Arial"/>
@@ -3649,16 +4668,24 @@
         </w:tc>
       </w:tr>
       <w:tr>
+        <w:trPr>
+          <w:cantSplit/>
+        </w:trPr>
         <w:tc>
           <w:tcPr>
-            <w:tcW w:type="dxa" w:w="2160"/>
+            <w:tcW w:type="dxa" w:w="2"/>
             <w:vAlign w:val="center"/>
           </w:tcPr>
           <w:p>
             <w:pPr>
+              <w:spacing w:after="40"/>
               <w:jc w:val="left"/>
             </w:pPr>
-            <w:r/>
+            <w:r>
+              <w:rPr>
+                <w:sz w:val="19"/>
+              </w:rPr>
+            </w:r>
             <w:r>
               <w:rPr>
                 <w:rFonts w:ascii="Arial" w:hAnsi="Arial"/>
@@ -3672,14 +4699,19 @@
         </w:tc>
         <w:tc>
           <w:tcPr>
-            <w:tcW w:type="dxa" w:w="4896"/>
+            <w:tcW w:type="dxa" w:w="4"/>
             <w:vAlign w:val="center"/>
           </w:tcPr>
           <w:p>
             <w:pPr>
+              <w:spacing w:after="40"/>
               <w:jc w:val="left"/>
             </w:pPr>
-            <w:r/>
+            <w:r>
+              <w:rPr>
+                <w:sz w:val="19"/>
+              </w:rPr>
+            </w:r>
             <w:r>
               <w:rPr>
                 <w:rFonts w:ascii="Arial" w:hAnsi="Arial"/>
@@ -3693,14 +4725,19 @@
         </w:tc>
         <w:tc>
           <w:tcPr>
-            <w:tcW w:type="dxa" w:w="4032"/>
+            <w:tcW w:type="dxa" w:w="8"/>
             <w:vAlign w:val="center"/>
           </w:tcPr>
           <w:p>
             <w:pPr>
+              <w:spacing w:after="40"/>
               <w:jc w:val="left"/>
             </w:pPr>
-            <w:r/>
+            <w:r>
+              <w:rPr>
+                <w:sz w:val="19"/>
+              </w:rPr>
+            </w:r>
             <w:r>
               <w:rPr>
                 <w:rFonts w:ascii="Arial" w:hAnsi="Arial"/>
@@ -3714,16 +4751,24 @@
         </w:tc>
       </w:tr>
       <w:tr>
+        <w:trPr>
+          <w:cantSplit/>
+        </w:trPr>
         <w:tc>
           <w:tcPr>
-            <w:tcW w:type="dxa" w:w="2160"/>
+            <w:tcW w:type="dxa" w:w="2"/>
             <w:vAlign w:val="center"/>
           </w:tcPr>
           <w:p>
             <w:pPr>
+              <w:spacing w:after="40"/>
               <w:jc w:val="left"/>
             </w:pPr>
-            <w:r/>
+            <w:r>
+              <w:rPr>
+                <w:sz w:val="19"/>
+              </w:rPr>
+            </w:r>
             <w:r>
               <w:rPr>
                 <w:rFonts w:ascii="Arial" w:hAnsi="Arial"/>
@@ -3737,14 +4782,19 @@
         </w:tc>
         <w:tc>
           <w:tcPr>
-            <w:tcW w:type="dxa" w:w="4896"/>
+            <w:tcW w:type="dxa" w:w="4"/>
             <w:vAlign w:val="center"/>
           </w:tcPr>
           <w:p>
             <w:pPr>
+              <w:spacing w:after="40"/>
               <w:jc w:val="left"/>
             </w:pPr>
-            <w:r/>
+            <w:r>
+              <w:rPr>
+                <w:sz w:val="19"/>
+              </w:rPr>
+            </w:r>
             <w:r>
               <w:rPr>
                 <w:rFonts w:ascii="Arial" w:hAnsi="Arial"/>
@@ -3758,14 +4808,19 @@
         </w:tc>
         <w:tc>
           <w:tcPr>
-            <w:tcW w:type="dxa" w:w="4032"/>
+            <w:tcW w:type="dxa" w:w="8"/>
             <w:vAlign w:val="center"/>
           </w:tcPr>
           <w:p>
             <w:pPr>
+              <w:spacing w:after="40"/>
               <w:jc w:val="left"/>
             </w:pPr>
-            <w:r/>
+            <w:r>
+              <w:rPr>
+                <w:sz w:val="19"/>
+              </w:rPr>
+            </w:r>
             <w:r>
               <w:rPr>
                 <w:rFonts w:ascii="Arial" w:hAnsi="Arial"/>
@@ -3779,16 +4834,24 @@
         </w:tc>
       </w:tr>
       <w:tr>
+        <w:trPr>
+          <w:cantSplit/>
+        </w:trPr>
         <w:tc>
           <w:tcPr>
-            <w:tcW w:type="dxa" w:w="2160"/>
+            <w:tcW w:type="dxa" w:w="2"/>
             <w:vAlign w:val="center"/>
           </w:tcPr>
           <w:p>
             <w:pPr>
+              <w:spacing w:after="40"/>
               <w:jc w:val="left"/>
             </w:pPr>
-            <w:r/>
+            <w:r>
+              <w:rPr>
+                <w:sz w:val="19"/>
+              </w:rPr>
+            </w:r>
             <w:r>
               <w:rPr>
                 <w:rFonts w:ascii="Arial" w:hAnsi="Arial"/>
@@ -3802,14 +4865,19 @@
         </w:tc>
         <w:tc>
           <w:tcPr>
-            <w:tcW w:type="dxa" w:w="4896"/>
+            <w:tcW w:type="dxa" w:w="4"/>
             <w:vAlign w:val="center"/>
           </w:tcPr>
           <w:p>
             <w:pPr>
+              <w:spacing w:after="40"/>
               <w:jc w:val="left"/>
             </w:pPr>
-            <w:r/>
+            <w:r>
+              <w:rPr>
+                <w:sz w:val="19"/>
+              </w:rPr>
+            </w:r>
             <w:r>
               <w:rPr>
                 <w:rFonts w:ascii="Arial" w:hAnsi="Arial"/>
@@ -3823,14 +4891,19 @@
         </w:tc>
         <w:tc>
           <w:tcPr>
-            <w:tcW w:type="dxa" w:w="4032"/>
+            <w:tcW w:type="dxa" w:w="8"/>
             <w:vAlign w:val="center"/>
           </w:tcPr>
           <w:p>
             <w:pPr>
+              <w:spacing w:after="40"/>
               <w:jc w:val="left"/>
             </w:pPr>
-            <w:r/>
+            <w:r>
+              <w:rPr>
+                <w:sz w:val="19"/>
+              </w:rPr>
+            </w:r>
             <w:r>
               <w:rPr>
                 <w:rFonts w:ascii="Arial" w:hAnsi="Arial"/>
@@ -3910,27 +4983,36 @@
     <w:tbl>
       <w:tblPr>
         <w:tblStyle w:val="TableGrid"/>
-        <w:tblW w:type="auto" w:w="0"/>
-        <w:jc w:val="left"/>
+        <w:tblW w:type="dxa" w:w="9000"/>
+        <w:jc w:val="center"/>
         <w:tblLayout w:type="fixed"/>
         <w:tblLook w:firstColumn="1" w:firstRow="1" w:lastColumn="0" w:lastRow="0" w:noHBand="0" w:noVBand="1" w:val="04A0"/>
       </w:tblPr>
       <w:tblGrid>
-        <w:gridCol w:w="4968"/>
-        <w:gridCol w:w="4968"/>
+        <w:gridCol w:w="3800"/>
+        <w:gridCol w:w="5200"/>
       </w:tblGrid>
       <w:tr>
+        <w:trPr>
+          <w:cantSplit/>
+          <w:tblHeader w:val="true"/>
+        </w:trPr>
         <w:tc>
           <w:tcPr>
-            <w:tcW w:type="dxa" w:w="4320"/>
+            <w:tcW w:type="dxa" w:w="6"/>
             <w:vAlign w:val="center"/>
             <w:shd w:fill="E2E8F0"/>
           </w:tcPr>
           <w:p>
             <w:pPr>
+              <w:spacing w:after="40"/>
               <w:jc w:val="left"/>
             </w:pPr>
-            <w:r/>
+            <w:r>
+              <w:rPr>
+                <w:sz w:val="19"/>
+              </w:rPr>
+            </w:r>
             <w:r>
               <w:rPr>
                 <w:rFonts w:ascii="Arial" w:hAnsi="Arial"/>
@@ -3944,15 +5026,20 @@
         </w:tc>
         <w:tc>
           <w:tcPr>
-            <w:tcW w:type="dxa" w:w="6768"/>
+            <w:tcW w:type="dxa" w:w="8"/>
             <w:vAlign w:val="center"/>
             <w:shd w:fill="E2E8F0"/>
           </w:tcPr>
           <w:p>
             <w:pPr>
+              <w:spacing w:after="40"/>
               <w:jc w:val="left"/>
             </w:pPr>
-            <w:r/>
+            <w:r>
+              <w:rPr>
+                <w:sz w:val="19"/>
+              </w:rPr>
+            </w:r>
             <w:r>
               <w:rPr>
                 <w:rFonts w:ascii="Arial" w:hAnsi="Arial"/>
@@ -3966,16 +5053,24 @@
         </w:tc>
       </w:tr>
       <w:tr>
+        <w:trPr>
+          <w:cantSplit/>
+        </w:trPr>
         <w:tc>
           <w:tcPr>
-            <w:tcW w:type="dxa" w:w="4320"/>
+            <w:tcW w:type="dxa" w:w="6"/>
             <w:vAlign w:val="center"/>
           </w:tcPr>
           <w:p>
             <w:pPr>
+              <w:spacing w:after="40"/>
               <w:jc w:val="left"/>
             </w:pPr>
-            <w:r/>
+            <w:r>
+              <w:rPr>
+                <w:sz w:val="19"/>
+              </w:rPr>
+            </w:r>
             <w:r>
               <w:rPr>
                 <w:rFonts w:ascii="Arial" w:hAnsi="Arial"/>
@@ -3989,14 +5084,19 @@
         </w:tc>
         <w:tc>
           <w:tcPr>
-            <w:tcW w:type="dxa" w:w="6768"/>
+            <w:tcW w:type="dxa" w:w="8"/>
             <w:vAlign w:val="center"/>
           </w:tcPr>
           <w:p>
             <w:pPr>
+              <w:spacing w:after="40"/>
               <w:jc w:val="left"/>
             </w:pPr>
-            <w:r/>
+            <w:r>
+              <w:rPr>
+                <w:sz w:val="19"/>
+              </w:rPr>
+            </w:r>
             <w:r>
               <w:rPr>
                 <w:rFonts w:ascii="Arial" w:hAnsi="Arial"/>
@@ -4010,16 +5110,24 @@
         </w:tc>
       </w:tr>
       <w:tr>
+        <w:trPr>
+          <w:cantSplit/>
+        </w:trPr>
         <w:tc>
           <w:tcPr>
-            <w:tcW w:type="dxa" w:w="4320"/>
+            <w:tcW w:type="dxa" w:w="6"/>
             <w:vAlign w:val="center"/>
           </w:tcPr>
           <w:p>
             <w:pPr>
+              <w:spacing w:after="40"/>
               <w:jc w:val="left"/>
             </w:pPr>
-            <w:r/>
+            <w:r>
+              <w:rPr>
+                <w:sz w:val="19"/>
+              </w:rPr>
+            </w:r>
             <w:r>
               <w:rPr>
                 <w:rFonts w:ascii="Arial" w:hAnsi="Arial"/>
@@ -4033,14 +5141,19 @@
         </w:tc>
         <w:tc>
           <w:tcPr>
-            <w:tcW w:type="dxa" w:w="6768"/>
+            <w:tcW w:type="dxa" w:w="8"/>
             <w:vAlign w:val="center"/>
           </w:tcPr>
           <w:p>
             <w:pPr>
+              <w:spacing w:after="40"/>
               <w:jc w:val="left"/>
             </w:pPr>
-            <w:r/>
+            <w:r>
+              <w:rPr>
+                <w:sz w:val="19"/>
+              </w:rPr>
+            </w:r>
             <w:r>
               <w:rPr>
                 <w:rFonts w:ascii="Arial" w:hAnsi="Arial"/>
@@ -4054,16 +5167,24 @@
         </w:tc>
       </w:tr>
       <w:tr>
+        <w:trPr>
+          <w:cantSplit/>
+        </w:trPr>
         <w:tc>
           <w:tcPr>
-            <w:tcW w:type="dxa" w:w="4320"/>
+            <w:tcW w:type="dxa" w:w="6"/>
             <w:vAlign w:val="center"/>
           </w:tcPr>
           <w:p>
             <w:pPr>
+              <w:spacing w:after="40"/>
               <w:jc w:val="left"/>
             </w:pPr>
-            <w:r/>
+            <w:r>
+              <w:rPr>
+                <w:sz w:val="19"/>
+              </w:rPr>
+            </w:r>
             <w:r>
               <w:rPr>
                 <w:rFonts w:ascii="Arial" w:hAnsi="Arial"/>
@@ -4077,14 +5198,19 @@
         </w:tc>
         <w:tc>
           <w:tcPr>
-            <w:tcW w:type="dxa" w:w="6768"/>
+            <w:tcW w:type="dxa" w:w="8"/>
             <w:vAlign w:val="center"/>
           </w:tcPr>
           <w:p>
             <w:pPr>
+              <w:spacing w:after="40"/>
               <w:jc w:val="left"/>
             </w:pPr>
-            <w:r/>
+            <w:r>
+              <w:rPr>
+                <w:sz w:val="19"/>
+              </w:rPr>
+            </w:r>
             <w:r>
               <w:rPr>
                 <w:rFonts w:ascii="Arial" w:hAnsi="Arial"/>
@@ -4098,16 +5224,24 @@
         </w:tc>
       </w:tr>
       <w:tr>
+        <w:trPr>
+          <w:cantSplit/>
+        </w:trPr>
         <w:tc>
           <w:tcPr>
-            <w:tcW w:type="dxa" w:w="4320"/>
+            <w:tcW w:type="dxa" w:w="6"/>
             <w:vAlign w:val="center"/>
           </w:tcPr>
           <w:p>
             <w:pPr>
+              <w:spacing w:after="40"/>
               <w:jc w:val="left"/>
             </w:pPr>
-            <w:r/>
+            <w:r>
+              <w:rPr>
+                <w:sz w:val="19"/>
+              </w:rPr>
+            </w:r>
             <w:r>
               <w:rPr>
                 <w:rFonts w:ascii="Arial" w:hAnsi="Arial"/>
@@ -4121,14 +5255,19 @@
         </w:tc>
         <w:tc>
           <w:tcPr>
-            <w:tcW w:type="dxa" w:w="6768"/>
+            <w:tcW w:type="dxa" w:w="8"/>
             <w:vAlign w:val="center"/>
           </w:tcPr>
           <w:p>
             <w:pPr>
+              <w:spacing w:after="40"/>
               <w:jc w:val="left"/>
             </w:pPr>
-            <w:r/>
+            <w:r>
+              <w:rPr>
+                <w:sz w:val="19"/>
+              </w:rPr>
+            </w:r>
             <w:r>
               <w:rPr>
                 <w:rFonts w:ascii="Arial" w:hAnsi="Arial"/>
@@ -4142,16 +5281,24 @@
         </w:tc>
       </w:tr>
       <w:tr>
+        <w:trPr>
+          <w:cantSplit/>
+        </w:trPr>
         <w:tc>
           <w:tcPr>
-            <w:tcW w:type="dxa" w:w="4320"/>
+            <w:tcW w:type="dxa" w:w="6"/>
             <w:vAlign w:val="center"/>
           </w:tcPr>
           <w:p>
             <w:pPr>
+              <w:spacing w:after="40"/>
               <w:jc w:val="left"/>
             </w:pPr>
-            <w:r/>
+            <w:r>
+              <w:rPr>
+                <w:sz w:val="19"/>
+              </w:rPr>
+            </w:r>
             <w:r>
               <w:rPr>
                 <w:rFonts w:ascii="Arial" w:hAnsi="Arial"/>
@@ -4165,14 +5312,19 @@
         </w:tc>
         <w:tc>
           <w:tcPr>
-            <w:tcW w:type="dxa" w:w="6768"/>
+            <w:tcW w:type="dxa" w:w="8"/>
             <w:vAlign w:val="center"/>
           </w:tcPr>
           <w:p>
             <w:pPr>
+              <w:spacing w:after="40"/>
               <w:jc w:val="left"/>
             </w:pPr>
-            <w:r/>
+            <w:r>
+              <w:rPr>
+                <w:sz w:val="19"/>
+              </w:rPr>
+            </w:r>
             <w:r>
               <w:rPr>
                 <w:rFonts w:ascii="Arial" w:hAnsi="Arial"/>
@@ -4186,16 +5338,24 @@
         </w:tc>
       </w:tr>
       <w:tr>
+        <w:trPr>
+          <w:cantSplit/>
+        </w:trPr>
         <w:tc>
           <w:tcPr>
-            <w:tcW w:type="dxa" w:w="4320"/>
+            <w:tcW w:type="dxa" w:w="6"/>
             <w:vAlign w:val="center"/>
           </w:tcPr>
           <w:p>
             <w:pPr>
+              <w:spacing w:after="40"/>
               <w:jc w:val="left"/>
             </w:pPr>
-            <w:r/>
+            <w:r>
+              <w:rPr>
+                <w:sz w:val="19"/>
+              </w:rPr>
+            </w:r>
             <w:r>
               <w:rPr>
                 <w:rFonts w:ascii="Arial" w:hAnsi="Arial"/>
@@ -4209,14 +5369,19 @@
         </w:tc>
         <w:tc>
           <w:tcPr>
-            <w:tcW w:type="dxa" w:w="6768"/>
+            <w:tcW w:type="dxa" w:w="8"/>
             <w:vAlign w:val="center"/>
           </w:tcPr>
           <w:p>
             <w:pPr>
+              <w:spacing w:after="40"/>
               <w:jc w:val="left"/>
             </w:pPr>
-            <w:r/>
+            <w:r>
+              <w:rPr>
+                <w:sz w:val="19"/>
+              </w:rPr>
+            </w:r>
             <w:r>
               <w:rPr>
                 <w:rFonts w:ascii="Arial" w:hAnsi="Arial"/>
@@ -4230,16 +5395,24 @@
         </w:tc>
       </w:tr>
       <w:tr>
+        <w:trPr>
+          <w:cantSplit/>
+        </w:trPr>
         <w:tc>
           <w:tcPr>
-            <w:tcW w:type="dxa" w:w="4320"/>
+            <w:tcW w:type="dxa" w:w="6"/>
             <w:vAlign w:val="center"/>
           </w:tcPr>
           <w:p>
             <w:pPr>
+              <w:spacing w:after="40"/>
               <w:jc w:val="left"/>
             </w:pPr>
-            <w:r/>
+            <w:r>
+              <w:rPr>
+                <w:sz w:val="19"/>
+              </w:rPr>
+            </w:r>
             <w:r>
               <w:rPr>
                 <w:rFonts w:ascii="Arial" w:hAnsi="Arial"/>
@@ -4253,14 +5426,19 @@
         </w:tc>
         <w:tc>
           <w:tcPr>
-            <w:tcW w:type="dxa" w:w="6768"/>
+            <w:tcW w:type="dxa" w:w="8"/>
             <w:vAlign w:val="center"/>
           </w:tcPr>
           <w:p>
             <w:pPr>
+              <w:spacing w:after="40"/>
               <w:jc w:val="left"/>
             </w:pPr>
-            <w:r/>
+            <w:r>
+              <w:rPr>
+                <w:sz w:val="19"/>
+              </w:rPr>
+            </w:r>
             <w:r>
               <w:rPr>
                 <w:rFonts w:ascii="Arial" w:hAnsi="Arial"/>
@@ -4274,16 +5452,24 @@
         </w:tc>
       </w:tr>
       <w:tr>
+        <w:trPr>
+          <w:cantSplit/>
+        </w:trPr>
         <w:tc>
           <w:tcPr>
-            <w:tcW w:type="dxa" w:w="4320"/>
+            <w:tcW w:type="dxa" w:w="6"/>
             <w:vAlign w:val="center"/>
           </w:tcPr>
           <w:p>
             <w:pPr>
+              <w:spacing w:after="40"/>
               <w:jc w:val="left"/>
             </w:pPr>
-            <w:r/>
+            <w:r>
+              <w:rPr>
+                <w:sz w:val="19"/>
+              </w:rPr>
+            </w:r>
             <w:r>
               <w:rPr>
                 <w:rFonts w:ascii="Arial" w:hAnsi="Arial"/>
@@ -4297,14 +5483,19 @@
         </w:tc>
         <w:tc>
           <w:tcPr>
-            <w:tcW w:type="dxa" w:w="6768"/>
+            <w:tcW w:type="dxa" w:w="8"/>
             <w:vAlign w:val="center"/>
           </w:tcPr>
           <w:p>
             <w:pPr>
+              <w:spacing w:after="40"/>
               <w:jc w:val="left"/>
             </w:pPr>
-            <w:r/>
+            <w:r>
+              <w:rPr>
+                <w:sz w:val="19"/>
+              </w:rPr>
+            </w:r>
             <w:r>
               <w:rPr>
                 <w:rFonts w:ascii="Arial" w:hAnsi="Arial"/>
@@ -4318,44 +5509,78 @@
         </w:tc>
       </w:tr>
       <w:tr>
+        <w:trPr>
+          <w:cantSplit/>
+        </w:trPr>
         <w:tc>
           <w:tcPr>
-            <w:tcW w:type="dxa" w:w="4968"/>
+            <w:tcW w:type="dxa" w:w="6"/>
+            <w:vAlign w:val="center"/>
           </w:tcPr>
           <w:p>
-            <w:r>
+            <w:pPr>
+              <w:spacing w:after="40"/>
+            </w:pPr>
+            <w:r>
+              <w:rPr>
+                <w:sz w:val="19"/>
+              </w:rPr>
               <w:t>GEMINI_API_KEY</w:t>
             </w:r>
           </w:p>
         </w:tc>
         <w:tc>
           <w:tcPr>
-            <w:tcW w:type="dxa" w:w="4968"/>
+            <w:tcW w:type="dxa" w:w="8"/>
+            <w:vAlign w:val="center"/>
           </w:tcPr>
           <w:p>
-            <w:r>
+            <w:pPr>
+              <w:spacing w:after="40"/>
+            </w:pPr>
+            <w:r>
+              <w:rPr>
+                <w:sz w:val="19"/>
+              </w:rPr>
               <w:t>Clé API utilisée par le backend pour appeler Gemini lors de la génération IA.</w:t>
             </w:r>
           </w:p>
         </w:tc>
       </w:tr>
       <w:tr>
+        <w:trPr>
+          <w:cantSplit/>
+        </w:trPr>
         <w:tc>
           <w:tcPr>
-            <w:tcW w:type="dxa" w:w="4968"/>
+            <w:tcW w:type="dxa" w:w="6"/>
+            <w:vAlign w:val="center"/>
           </w:tcPr>
           <w:p>
-            <w:r>
+            <w:pPr>
+              <w:spacing w:after="40"/>
+            </w:pPr>
+            <w:r>
+              <w:rPr>
+                <w:sz w:val="19"/>
+              </w:rPr>
               <w:t>GEMINI_MODEL</w:t>
             </w:r>
           </w:p>
         </w:tc>
         <w:tc>
           <w:tcPr>
-            <w:tcW w:type="dxa" w:w="4968"/>
+            <w:tcW w:type="dxa" w:w="8"/>
+            <w:vAlign w:val="center"/>
           </w:tcPr>
           <w:p>
-            <w:r>
+            <w:pPr>
+              <w:spacing w:after="40"/>
+            </w:pPr>
+            <w:r>
+              <w:rPr>
+                <w:sz w:val="19"/>
+              </w:rPr>
               <w:t>Modèle Gemini utilisé pour la génération, par exemple gemini-2.5-flash.</w:t>
             </w:r>
           </w:p>

</xml_diff>